<commit_message>
feat: cotizador profesional con formato ADIS (secciones 01-09, folio auto, fotos, PDF)
</commit_message>
<xml_diff>
--- a/Formato de Cotizacion nuevo.docx
+++ b/Formato de Cotizacion nuevo.docx
@@ -25,12 +25,6 @@
         <w:gridCol w:w="3651"/>
       </w:tblGrid>
       <w:tr>
-        <w:tblPrEx>
-          <w:tblCellMar>
-            <w:top w:w="0" w:type="dxa"/>
-            <w:bottom w:w="0" w:type="dxa"/>
-          </w:tblCellMar>
-        </w:tblPrEx>
         <w:trPr>
           <w:cantSplit/>
         </w:trPr>
@@ -196,7 +190,31 @@
                 <w:sz w:val="18"/>
                 <w:szCs w:val="18"/>
               </w:rPr>
-              <w:t>COTIZACIÓN N.º  ADIS-2026-________</w:t>
+              <w:t xml:space="preserve">COTIZACIÓN </w:t>
+            </w:r>
+            <w:proofErr w:type="gramStart"/>
+            <w:r>
+              <w:rPr>
+                <w:rFonts w:ascii="Arial" w:hAnsi="Arial" w:cs="Arial"/>
+                <w:b/>
+                <w:bCs/>
+                <w:color w:val="FFFFFF"/>
+                <w:sz w:val="18"/>
+                <w:szCs w:val="18"/>
+              </w:rPr>
+              <w:t>N.º  ADIS</w:t>
+            </w:r>
+            <w:proofErr w:type="gramEnd"/>
+            <w:r>
+              <w:rPr>
+                <w:rFonts w:ascii="Arial" w:hAnsi="Arial" w:cs="Arial"/>
+                <w:b/>
+                <w:bCs/>
+                <w:color w:val="FFFFFF"/>
+                <w:sz w:val="18"/>
+                <w:szCs w:val="18"/>
+              </w:rPr>
+              <w:t>-2026-________</w:t>
             </w:r>
           </w:p>
           <w:p>
@@ -287,12 +305,6 @@
         <w:gridCol w:w="3570"/>
       </w:tblGrid>
       <w:tr>
-        <w:tblPrEx>
-          <w:tblCellMar>
-            <w:top w:w="0" w:type="dxa"/>
-            <w:bottom w:w="0" w:type="dxa"/>
-          </w:tblCellMar>
-        </w:tblPrEx>
         <w:tc>
           <w:tcPr>
             <w:tcW w:w="1700" w:type="dxa"/>
@@ -348,12 +360,6 @@
         </w:tc>
       </w:tr>
       <w:tr>
-        <w:tblPrEx>
-          <w:tblCellMar>
-            <w:top w:w="0" w:type="dxa"/>
-            <w:bottom w:w="0" w:type="dxa"/>
-          </w:tblCellMar>
-        </w:tblPrEx>
         <w:tc>
           <w:tcPr>
             <w:tcW w:w="1700" w:type="dxa"/>
@@ -460,12 +466,6 @@
         </w:tc>
       </w:tr>
       <w:tr>
-        <w:tblPrEx>
-          <w:tblCellMar>
-            <w:top w:w="0" w:type="dxa"/>
-            <w:bottom w:w="0" w:type="dxa"/>
-          </w:tblCellMar>
-        </w:tblPrEx>
         <w:tc>
           <w:tcPr>
             <w:tcW w:w="1700" w:type="dxa"/>
@@ -614,12 +614,6 @@
         <w:gridCol w:w="10540"/>
       </w:tblGrid>
       <w:tr>
-        <w:tblPrEx>
-          <w:tblCellMar>
-            <w:top w:w="0" w:type="dxa"/>
-            <w:bottom w:w="0" w:type="dxa"/>
-          </w:tblCellMar>
-        </w:tblPrEx>
         <w:trPr>
           <w:trHeight w:val="3000"/>
         </w:trPr>
@@ -731,12 +725,6 @@
         <w:gridCol w:w="3513"/>
       </w:tblGrid>
       <w:tr>
-        <w:tblPrEx>
-          <w:tblCellMar>
-            <w:top w:w="0" w:type="dxa"/>
-            <w:bottom w:w="0" w:type="dxa"/>
-          </w:tblCellMar>
-        </w:tblPrEx>
         <w:tc>
           <w:tcPr>
             <w:tcW w:w="3514" w:type="dxa"/>
@@ -913,12 +901,6 @@
         </w:tc>
       </w:tr>
       <w:tr>
-        <w:tblPrEx>
-          <w:tblCellMar>
-            <w:top w:w="0" w:type="dxa"/>
-            <w:bottom w:w="0" w:type="dxa"/>
-          </w:tblCellMar>
-        </w:tblPrEx>
         <w:tc>
           <w:tcPr>
             <w:tcW w:w="3514" w:type="dxa"/>
@@ -1095,12 +1077,6 @@
         </w:tc>
       </w:tr>
       <w:tr>
-        <w:tblPrEx>
-          <w:tblCellMar>
-            <w:top w:w="0" w:type="dxa"/>
-            <w:bottom w:w="0" w:type="dxa"/>
-          </w:tblCellMar>
-        </w:tblPrEx>
         <w:tc>
           <w:tcPr>
             <w:tcW w:w="3514" w:type="dxa"/>
@@ -1277,12 +1253,6 @@
         </w:tc>
       </w:tr>
       <w:tr>
-        <w:tblPrEx>
-          <w:tblCellMar>
-            <w:top w:w="0" w:type="dxa"/>
-            <w:bottom w:w="0" w:type="dxa"/>
-          </w:tblCellMar>
-        </w:tblPrEx>
         <w:tc>
           <w:tcPr>
             <w:tcW w:w="3514" w:type="dxa"/>
@@ -1459,12 +1429,6 @@
         </w:tc>
       </w:tr>
       <w:tr>
-        <w:tblPrEx>
-          <w:tblCellMar>
-            <w:top w:w="0" w:type="dxa"/>
-            <w:bottom w:w="0" w:type="dxa"/>
-          </w:tblCellMar>
-        </w:tblPrEx>
         <w:tc>
           <w:tcPr>
             <w:tcW w:w="10540" w:type="dxa"/>
@@ -1562,12 +1526,6 @@
         <w:gridCol w:w="7140"/>
       </w:tblGrid>
       <w:tr>
-        <w:tblPrEx>
-          <w:tblCellMar>
-            <w:top w:w="0" w:type="dxa"/>
-            <w:bottom w:w="0" w:type="dxa"/>
-          </w:tblCellMar>
-        </w:tblPrEx>
         <w:tc>
           <w:tcPr>
             <w:tcW w:w="3400" w:type="dxa"/>
@@ -1614,12 +1572,6 @@
         </w:tc>
       </w:tr>
       <w:tr>
-        <w:tblPrEx>
-          <w:tblCellMar>
-            <w:top w:w="0" w:type="dxa"/>
-            <w:bottom w:w="0" w:type="dxa"/>
-          </w:tblCellMar>
-        </w:tblPrEx>
         <w:tc>
           <w:tcPr>
             <w:tcW w:w="3400" w:type="dxa"/>
@@ -1666,12 +1618,6 @@
         </w:tc>
       </w:tr>
       <w:tr>
-        <w:tblPrEx>
-          <w:tblCellMar>
-            <w:top w:w="0" w:type="dxa"/>
-            <w:bottom w:w="0" w:type="dxa"/>
-          </w:tblCellMar>
-        </w:tblPrEx>
         <w:tc>
           <w:tcPr>
             <w:tcW w:w="3400" w:type="dxa"/>
@@ -1742,6 +1688,7 @@
         <w:lastRenderedPageBreak/>
         <w:t xml:space="preserve">03   </w:t>
       </w:r>
+      <w:proofErr w:type="gramStart"/>
       <w:r>
         <w:rPr>
           <w:rFonts w:ascii="Arial" w:hAnsi="Arial" w:cs="Arial"/>
@@ -1752,1580 +1699,325 @@
           <w:sz w:val="22"/>
           <w:szCs w:val="22"/>
         </w:rPr>
-        <w:t>DESGLOSE DE INVERSIÓN</w:t>
+        <w:t>Inversión</w:t>
       </w:r>
-    </w:p>
-    <w:tbl>
-      <w:tblPr>
-        <w:tblW w:w="10540" w:type="dxa"/>
-        <w:tblBorders>
-          <w:top w:val="single" w:sz="4" w:space="0" w:color="D9D3C3"/>
-          <w:left w:val="single" w:sz="4" w:space="0" w:color="D9D3C3"/>
-          <w:bottom w:val="single" w:sz="4" w:space="0" w:color="D9D3C3"/>
-          <w:right w:val="single" w:sz="4" w:space="0" w:color="D9D3C3"/>
-          <w:insideH w:val="single" w:sz="4" w:space="0" w:color="D9D3C3"/>
-          <w:insideV w:val="single" w:sz="4" w:space="0" w:color="D9D3C3"/>
-        </w:tblBorders>
-        <w:tblCellMar>
-          <w:left w:w="10" w:type="dxa"/>
-          <w:right w:w="10" w:type="dxa"/>
-        </w:tblCellMar>
-        <w:tblLook w:val="0000" w:firstRow="0" w:lastRow="0" w:firstColumn="0" w:lastColumn="0" w:noHBand="0" w:noVBand="0"/>
-      </w:tblPr>
-      <w:tblGrid>
-        <w:gridCol w:w="1271"/>
-        <w:gridCol w:w="4795"/>
-        <w:gridCol w:w="939"/>
-        <w:gridCol w:w="1105"/>
-        <w:gridCol w:w="1215"/>
-        <w:gridCol w:w="1215"/>
-      </w:tblGrid>
-      <w:tr>
-        <w:tblPrEx>
-          <w:tblCellMar>
-            <w:top w:w="0" w:type="dxa"/>
-            <w:bottom w:w="0" w:type="dxa"/>
-          </w:tblCellMar>
-        </w:tblPrEx>
-        <w:trPr>
-          <w:cantSplit/>
-          <w:tblHeader/>
-        </w:trPr>
-        <w:tc>
-          <w:tcPr>
-            <w:tcW w:w="1150" w:type="dxa"/>
-            <w:tcBorders>
-              <w:top w:val="single" w:sz="4" w:space="0" w:color="D9D3C3"/>
-              <w:left w:val="single" w:sz="4" w:space="0" w:color="D9D3C3"/>
-              <w:bottom w:val="single" w:sz="4" w:space="0" w:color="D9D3C3"/>
-              <w:right w:val="single" w:sz="4" w:space="0" w:color="D9D3C3"/>
-            </w:tcBorders>
-            <w:shd w:val="clear" w:color="auto" w:fill="141414"/>
-            <w:tcMar>
-              <w:top w:w="90" w:type="dxa"/>
-              <w:left w:w="120" w:type="dxa"/>
-              <w:bottom w:w="90" w:type="dxa"/>
-              <w:right w:w="120" w:type="dxa"/>
-            </w:tcMar>
-            <w:vAlign w:val="center"/>
-          </w:tcPr>
-          <w:p>
-            <w:r>
-              <w:rPr>
-                <w:rFonts w:ascii="Arial" w:hAnsi="Arial" w:cs="Arial"/>
-                <w:b/>
-                <w:bCs/>
-                <w:color w:val="FFFFFF"/>
-                <w:sz w:val="15"/>
-                <w:szCs w:val="15"/>
-              </w:rPr>
-              <w:t>CÓDIGO</w:t>
-            </w:r>
-          </w:p>
-        </w:tc>
-        <w:tc>
-          <w:tcPr>
-            <w:tcW w:w="4340" w:type="dxa"/>
-            <w:tcBorders>
-              <w:top w:val="single" w:sz="4" w:space="0" w:color="D9D3C3"/>
-              <w:left w:val="single" w:sz="4" w:space="0" w:color="D9D3C3"/>
-              <w:bottom w:val="single" w:sz="4" w:space="0" w:color="D9D3C3"/>
-              <w:right w:val="single" w:sz="4" w:space="0" w:color="D9D3C3"/>
-            </w:tcBorders>
-            <w:shd w:val="clear" w:color="auto" w:fill="141414"/>
-            <w:tcMar>
-              <w:top w:w="90" w:type="dxa"/>
-              <w:left w:w="120" w:type="dxa"/>
-              <w:bottom w:w="90" w:type="dxa"/>
-              <w:right w:w="120" w:type="dxa"/>
-            </w:tcMar>
-            <w:vAlign w:val="center"/>
-          </w:tcPr>
-          <w:p>
-            <w:r>
-              <w:rPr>
-                <w:rFonts w:ascii="Arial" w:hAnsi="Arial" w:cs="Arial"/>
-                <w:b/>
-                <w:bCs/>
-                <w:color w:val="FFFFFF"/>
-                <w:sz w:val="15"/>
-                <w:szCs w:val="15"/>
-              </w:rPr>
-              <w:t>DESCRIPCIÓN / ESPECIFICACIONES</w:t>
-            </w:r>
-          </w:p>
-        </w:tc>
-        <w:tc>
-          <w:tcPr>
-            <w:tcW w:w="850" w:type="dxa"/>
-            <w:tcBorders>
-              <w:top w:val="single" w:sz="4" w:space="0" w:color="D9D3C3"/>
-              <w:left w:val="single" w:sz="4" w:space="0" w:color="D9D3C3"/>
-              <w:bottom w:val="single" w:sz="4" w:space="0" w:color="D9D3C3"/>
-              <w:right w:val="single" w:sz="4" w:space="0" w:color="D9D3C3"/>
-            </w:tcBorders>
-            <w:shd w:val="clear" w:color="auto" w:fill="141414"/>
-            <w:tcMar>
-              <w:top w:w="90" w:type="dxa"/>
-              <w:left w:w="120" w:type="dxa"/>
-              <w:bottom w:w="90" w:type="dxa"/>
-              <w:right w:w="120" w:type="dxa"/>
-            </w:tcMar>
-            <w:vAlign w:val="center"/>
-          </w:tcPr>
-          <w:p>
-            <w:pPr>
-              <w:jc w:val="center"/>
-            </w:pPr>
-            <w:r>
-              <w:rPr>
-                <w:rFonts w:ascii="Arial" w:hAnsi="Arial" w:cs="Arial"/>
-                <w:b/>
-                <w:bCs/>
-                <w:color w:val="FFFFFF"/>
-                <w:sz w:val="15"/>
-                <w:szCs w:val="15"/>
-              </w:rPr>
-              <w:t>CANT.</w:t>
-            </w:r>
-          </w:p>
-        </w:tc>
-        <w:tc>
-          <w:tcPr>
-            <w:tcW w:w="1000" w:type="dxa"/>
-            <w:tcBorders>
-              <w:top w:val="single" w:sz="4" w:space="0" w:color="D9D3C3"/>
-              <w:left w:val="single" w:sz="4" w:space="0" w:color="D9D3C3"/>
-              <w:bottom w:val="single" w:sz="4" w:space="0" w:color="D9D3C3"/>
-              <w:right w:val="single" w:sz="4" w:space="0" w:color="D9D3C3"/>
-            </w:tcBorders>
-            <w:shd w:val="clear" w:color="auto" w:fill="141414"/>
-            <w:tcMar>
-              <w:top w:w="90" w:type="dxa"/>
-              <w:left w:w="120" w:type="dxa"/>
-              <w:bottom w:w="90" w:type="dxa"/>
-              <w:right w:w="120" w:type="dxa"/>
-            </w:tcMar>
-            <w:vAlign w:val="center"/>
-          </w:tcPr>
-          <w:p>
-            <w:pPr>
-              <w:jc w:val="center"/>
-            </w:pPr>
-            <w:r>
-              <w:rPr>
-                <w:rFonts w:ascii="Arial" w:hAnsi="Arial" w:cs="Arial"/>
-                <w:b/>
-                <w:bCs/>
-                <w:color w:val="FFFFFF"/>
-                <w:sz w:val="15"/>
-                <w:szCs w:val="15"/>
-              </w:rPr>
-              <w:t>UNIDAD</w:t>
-            </w:r>
-          </w:p>
-        </w:tc>
-        <w:tc>
-          <w:tcPr>
-            <w:tcW w:w="1100" w:type="dxa"/>
-            <w:tcBorders>
-              <w:top w:val="single" w:sz="4" w:space="0" w:color="D9D3C3"/>
-              <w:left w:val="single" w:sz="4" w:space="0" w:color="D9D3C3"/>
-              <w:bottom w:val="single" w:sz="4" w:space="0" w:color="D9D3C3"/>
-              <w:right w:val="single" w:sz="4" w:space="0" w:color="D9D3C3"/>
-            </w:tcBorders>
-            <w:shd w:val="clear" w:color="auto" w:fill="141414"/>
-            <w:tcMar>
-              <w:top w:w="90" w:type="dxa"/>
-              <w:left w:w="120" w:type="dxa"/>
-              <w:bottom w:w="90" w:type="dxa"/>
-              <w:right w:w="120" w:type="dxa"/>
-            </w:tcMar>
-            <w:vAlign w:val="center"/>
-          </w:tcPr>
-          <w:p>
-            <w:pPr>
-              <w:jc w:val="center"/>
-            </w:pPr>
-            <w:r>
-              <w:rPr>
-                <w:rFonts w:ascii="Arial" w:hAnsi="Arial" w:cs="Arial"/>
-                <w:b/>
-                <w:bCs/>
-                <w:color w:val="FFFFFF"/>
-                <w:sz w:val="15"/>
-                <w:szCs w:val="15"/>
-              </w:rPr>
-              <w:t>P. UNITARIO</w:t>
-            </w:r>
-          </w:p>
-        </w:tc>
-        <w:tc>
-          <w:tcPr>
-            <w:tcW w:w="1100" w:type="dxa"/>
-            <w:tcBorders>
-              <w:top w:val="single" w:sz="4" w:space="0" w:color="D9D3C3"/>
-              <w:left w:val="single" w:sz="4" w:space="0" w:color="D9D3C3"/>
-              <w:bottom w:val="single" w:sz="4" w:space="0" w:color="D9D3C3"/>
-              <w:right w:val="single" w:sz="4" w:space="0" w:color="D9D3C3"/>
-            </w:tcBorders>
-            <w:shd w:val="clear" w:color="auto" w:fill="141414"/>
-            <w:tcMar>
-              <w:top w:w="90" w:type="dxa"/>
-              <w:left w:w="120" w:type="dxa"/>
-              <w:bottom w:w="90" w:type="dxa"/>
-              <w:right w:w="120" w:type="dxa"/>
-            </w:tcMar>
-            <w:vAlign w:val="center"/>
-          </w:tcPr>
-          <w:p>
-            <w:pPr>
-              <w:jc w:val="center"/>
-            </w:pPr>
-            <w:r>
-              <w:rPr>
-                <w:rFonts w:ascii="Arial" w:hAnsi="Arial" w:cs="Arial"/>
-                <w:b/>
-                <w:bCs/>
-                <w:color w:val="FFFFFF"/>
-                <w:sz w:val="15"/>
-                <w:szCs w:val="15"/>
-              </w:rPr>
-              <w:t>IMPORTE</w:t>
-            </w:r>
-          </w:p>
-        </w:tc>
-      </w:tr>
-      <w:tr>
-        <w:tblPrEx>
-          <w:tblCellMar>
-            <w:top w:w="0" w:type="dxa"/>
-            <w:bottom w:w="0" w:type="dxa"/>
-          </w:tblCellMar>
-        </w:tblPrEx>
-        <w:trPr>
-          <w:trHeight w:val="420"/>
-        </w:trPr>
-        <w:tc>
-          <w:tcPr>
-            <w:tcW w:w="1150" w:type="dxa"/>
-            <w:tcBorders>
-              <w:top w:val="single" w:sz="4" w:space="0" w:color="D9D3C3"/>
-              <w:left w:val="single" w:sz="4" w:space="0" w:color="D9D3C3"/>
-              <w:bottom w:val="single" w:sz="4" w:space="0" w:color="D9D3C3"/>
-              <w:right w:val="single" w:sz="4" w:space="0" w:color="D9D3C3"/>
-            </w:tcBorders>
-            <w:tcMar>
-              <w:top w:w="90" w:type="dxa"/>
-              <w:left w:w="120" w:type="dxa"/>
-              <w:bottom w:w="90" w:type="dxa"/>
-              <w:right w:w="120" w:type="dxa"/>
-            </w:tcMar>
-            <w:vAlign w:val="center"/>
-          </w:tcPr>
-          <w:p/>
-        </w:tc>
-        <w:tc>
-          <w:tcPr>
-            <w:tcW w:w="4340" w:type="dxa"/>
-            <w:tcBorders>
-              <w:top w:val="single" w:sz="4" w:space="0" w:color="D9D3C3"/>
-              <w:left w:val="single" w:sz="4" w:space="0" w:color="D9D3C3"/>
-              <w:bottom w:val="single" w:sz="4" w:space="0" w:color="D9D3C3"/>
-              <w:right w:val="single" w:sz="4" w:space="0" w:color="D9D3C3"/>
-            </w:tcBorders>
-            <w:tcMar>
-              <w:top w:w="90" w:type="dxa"/>
-              <w:left w:w="120" w:type="dxa"/>
-              <w:bottom w:w="90" w:type="dxa"/>
-              <w:right w:w="120" w:type="dxa"/>
-            </w:tcMar>
-            <w:vAlign w:val="center"/>
-          </w:tcPr>
-          <w:p/>
-        </w:tc>
-        <w:tc>
-          <w:tcPr>
-            <w:tcW w:w="850" w:type="dxa"/>
-            <w:tcBorders>
-              <w:top w:val="single" w:sz="4" w:space="0" w:color="D9D3C3"/>
-              <w:left w:val="single" w:sz="4" w:space="0" w:color="D9D3C3"/>
-              <w:bottom w:val="single" w:sz="4" w:space="0" w:color="D9D3C3"/>
-              <w:right w:val="single" w:sz="4" w:space="0" w:color="D9D3C3"/>
-            </w:tcBorders>
-            <w:tcMar>
-              <w:top w:w="90" w:type="dxa"/>
-              <w:left w:w="120" w:type="dxa"/>
-              <w:bottom w:w="90" w:type="dxa"/>
-              <w:right w:w="120" w:type="dxa"/>
-            </w:tcMar>
-            <w:vAlign w:val="center"/>
-          </w:tcPr>
-          <w:p/>
-        </w:tc>
-        <w:tc>
-          <w:tcPr>
-            <w:tcW w:w="1000" w:type="dxa"/>
-            <w:tcBorders>
-              <w:top w:val="single" w:sz="4" w:space="0" w:color="D9D3C3"/>
-              <w:left w:val="single" w:sz="4" w:space="0" w:color="D9D3C3"/>
-              <w:bottom w:val="single" w:sz="4" w:space="0" w:color="D9D3C3"/>
-              <w:right w:val="single" w:sz="4" w:space="0" w:color="D9D3C3"/>
-            </w:tcBorders>
-            <w:tcMar>
-              <w:top w:w="90" w:type="dxa"/>
-              <w:left w:w="120" w:type="dxa"/>
-              <w:bottom w:w="90" w:type="dxa"/>
-              <w:right w:w="120" w:type="dxa"/>
-            </w:tcMar>
-            <w:vAlign w:val="center"/>
-          </w:tcPr>
-          <w:p/>
-        </w:tc>
-        <w:tc>
-          <w:tcPr>
-            <w:tcW w:w="1100" w:type="dxa"/>
-            <w:tcBorders>
-              <w:top w:val="single" w:sz="4" w:space="0" w:color="D9D3C3"/>
-              <w:left w:val="single" w:sz="4" w:space="0" w:color="D9D3C3"/>
-              <w:bottom w:val="single" w:sz="4" w:space="0" w:color="D9D3C3"/>
-              <w:right w:val="single" w:sz="4" w:space="0" w:color="D9D3C3"/>
-            </w:tcBorders>
-            <w:tcMar>
-              <w:top w:w="90" w:type="dxa"/>
-              <w:left w:w="120" w:type="dxa"/>
-              <w:bottom w:w="90" w:type="dxa"/>
-              <w:right w:w="120" w:type="dxa"/>
-            </w:tcMar>
-            <w:vAlign w:val="center"/>
-          </w:tcPr>
-          <w:p/>
-        </w:tc>
-        <w:tc>
-          <w:tcPr>
-            <w:tcW w:w="1100" w:type="dxa"/>
-            <w:tcBorders>
-              <w:top w:val="single" w:sz="4" w:space="0" w:color="D9D3C3"/>
-              <w:left w:val="single" w:sz="4" w:space="0" w:color="D9D3C3"/>
-              <w:bottom w:val="single" w:sz="4" w:space="0" w:color="D9D3C3"/>
-              <w:right w:val="single" w:sz="4" w:space="0" w:color="D9D3C3"/>
-            </w:tcBorders>
-            <w:tcMar>
-              <w:top w:w="90" w:type="dxa"/>
-              <w:left w:w="120" w:type="dxa"/>
-              <w:bottom w:w="90" w:type="dxa"/>
-              <w:right w:w="120" w:type="dxa"/>
-            </w:tcMar>
-            <w:vAlign w:val="center"/>
-          </w:tcPr>
-          <w:p/>
-        </w:tc>
-      </w:tr>
-      <w:tr>
-        <w:tblPrEx>
-          <w:tblCellMar>
-            <w:top w:w="0" w:type="dxa"/>
-            <w:bottom w:w="0" w:type="dxa"/>
-          </w:tblCellMar>
-        </w:tblPrEx>
-        <w:trPr>
-          <w:trHeight w:val="420"/>
-        </w:trPr>
-        <w:tc>
-          <w:tcPr>
-            <w:tcW w:w="1150" w:type="dxa"/>
-            <w:tcBorders>
-              <w:top w:val="single" w:sz="4" w:space="0" w:color="D9D3C3"/>
-              <w:left w:val="single" w:sz="4" w:space="0" w:color="D9D3C3"/>
-              <w:bottom w:val="single" w:sz="4" w:space="0" w:color="D9D3C3"/>
-              <w:right w:val="single" w:sz="4" w:space="0" w:color="D9D3C3"/>
-            </w:tcBorders>
-            <w:shd w:val="clear" w:color="auto" w:fill="F7F4EE"/>
-            <w:tcMar>
-              <w:top w:w="90" w:type="dxa"/>
-              <w:left w:w="120" w:type="dxa"/>
-              <w:bottom w:w="90" w:type="dxa"/>
-              <w:right w:w="120" w:type="dxa"/>
-            </w:tcMar>
-            <w:vAlign w:val="center"/>
-          </w:tcPr>
-          <w:p/>
-        </w:tc>
-        <w:tc>
-          <w:tcPr>
-            <w:tcW w:w="4340" w:type="dxa"/>
-            <w:tcBorders>
-              <w:top w:val="single" w:sz="4" w:space="0" w:color="D9D3C3"/>
-              <w:left w:val="single" w:sz="4" w:space="0" w:color="D9D3C3"/>
-              <w:bottom w:val="single" w:sz="4" w:space="0" w:color="D9D3C3"/>
-              <w:right w:val="single" w:sz="4" w:space="0" w:color="D9D3C3"/>
-            </w:tcBorders>
-            <w:shd w:val="clear" w:color="auto" w:fill="F7F4EE"/>
-            <w:tcMar>
-              <w:top w:w="90" w:type="dxa"/>
-              <w:left w:w="120" w:type="dxa"/>
-              <w:bottom w:w="90" w:type="dxa"/>
-              <w:right w:w="120" w:type="dxa"/>
-            </w:tcMar>
-            <w:vAlign w:val="center"/>
-          </w:tcPr>
-          <w:p/>
-        </w:tc>
-        <w:tc>
-          <w:tcPr>
-            <w:tcW w:w="850" w:type="dxa"/>
-            <w:tcBorders>
-              <w:top w:val="single" w:sz="4" w:space="0" w:color="D9D3C3"/>
-              <w:left w:val="single" w:sz="4" w:space="0" w:color="D9D3C3"/>
-              <w:bottom w:val="single" w:sz="4" w:space="0" w:color="D9D3C3"/>
-              <w:right w:val="single" w:sz="4" w:space="0" w:color="D9D3C3"/>
-            </w:tcBorders>
-            <w:shd w:val="clear" w:color="auto" w:fill="F7F4EE"/>
-            <w:tcMar>
-              <w:top w:w="90" w:type="dxa"/>
-              <w:left w:w="120" w:type="dxa"/>
-              <w:bottom w:w="90" w:type="dxa"/>
-              <w:right w:w="120" w:type="dxa"/>
-            </w:tcMar>
-            <w:vAlign w:val="center"/>
-          </w:tcPr>
-          <w:p/>
-        </w:tc>
-        <w:tc>
-          <w:tcPr>
-            <w:tcW w:w="1000" w:type="dxa"/>
-            <w:tcBorders>
-              <w:top w:val="single" w:sz="4" w:space="0" w:color="D9D3C3"/>
-              <w:left w:val="single" w:sz="4" w:space="0" w:color="D9D3C3"/>
-              <w:bottom w:val="single" w:sz="4" w:space="0" w:color="D9D3C3"/>
-              <w:right w:val="single" w:sz="4" w:space="0" w:color="D9D3C3"/>
-            </w:tcBorders>
-            <w:shd w:val="clear" w:color="auto" w:fill="F7F4EE"/>
-            <w:tcMar>
-              <w:top w:w="90" w:type="dxa"/>
-              <w:left w:w="120" w:type="dxa"/>
-              <w:bottom w:w="90" w:type="dxa"/>
-              <w:right w:w="120" w:type="dxa"/>
-            </w:tcMar>
-            <w:vAlign w:val="center"/>
-          </w:tcPr>
-          <w:p/>
-        </w:tc>
-        <w:tc>
-          <w:tcPr>
-            <w:tcW w:w="1100" w:type="dxa"/>
-            <w:tcBorders>
-              <w:top w:val="single" w:sz="4" w:space="0" w:color="D9D3C3"/>
-              <w:left w:val="single" w:sz="4" w:space="0" w:color="D9D3C3"/>
-              <w:bottom w:val="single" w:sz="4" w:space="0" w:color="D9D3C3"/>
-              <w:right w:val="single" w:sz="4" w:space="0" w:color="D9D3C3"/>
-            </w:tcBorders>
-            <w:shd w:val="clear" w:color="auto" w:fill="F7F4EE"/>
-            <w:tcMar>
-              <w:top w:w="90" w:type="dxa"/>
-              <w:left w:w="120" w:type="dxa"/>
-              <w:bottom w:w="90" w:type="dxa"/>
-              <w:right w:w="120" w:type="dxa"/>
-            </w:tcMar>
-            <w:vAlign w:val="center"/>
-          </w:tcPr>
-          <w:p/>
-        </w:tc>
-        <w:tc>
-          <w:tcPr>
-            <w:tcW w:w="1100" w:type="dxa"/>
-            <w:tcBorders>
-              <w:top w:val="single" w:sz="4" w:space="0" w:color="D9D3C3"/>
-              <w:left w:val="single" w:sz="4" w:space="0" w:color="D9D3C3"/>
-              <w:bottom w:val="single" w:sz="4" w:space="0" w:color="D9D3C3"/>
-              <w:right w:val="single" w:sz="4" w:space="0" w:color="D9D3C3"/>
-            </w:tcBorders>
-            <w:shd w:val="clear" w:color="auto" w:fill="F7F4EE"/>
-            <w:tcMar>
-              <w:top w:w="90" w:type="dxa"/>
-              <w:left w:w="120" w:type="dxa"/>
-              <w:bottom w:w="90" w:type="dxa"/>
-              <w:right w:w="120" w:type="dxa"/>
-            </w:tcMar>
-            <w:vAlign w:val="center"/>
-          </w:tcPr>
-          <w:p/>
-        </w:tc>
-      </w:tr>
-      <w:tr>
-        <w:tblPrEx>
-          <w:tblCellMar>
-            <w:top w:w="0" w:type="dxa"/>
-            <w:bottom w:w="0" w:type="dxa"/>
-          </w:tblCellMar>
-        </w:tblPrEx>
-        <w:trPr>
-          <w:trHeight w:val="420"/>
-        </w:trPr>
-        <w:tc>
-          <w:tcPr>
-            <w:tcW w:w="1150" w:type="dxa"/>
-            <w:tcBorders>
-              <w:top w:val="single" w:sz="4" w:space="0" w:color="D9D3C3"/>
-              <w:left w:val="single" w:sz="4" w:space="0" w:color="D9D3C3"/>
-              <w:bottom w:val="single" w:sz="4" w:space="0" w:color="D9D3C3"/>
-              <w:right w:val="single" w:sz="4" w:space="0" w:color="D9D3C3"/>
-            </w:tcBorders>
-            <w:tcMar>
-              <w:top w:w="90" w:type="dxa"/>
-              <w:left w:w="120" w:type="dxa"/>
-              <w:bottom w:w="90" w:type="dxa"/>
-              <w:right w:w="120" w:type="dxa"/>
-            </w:tcMar>
-            <w:vAlign w:val="center"/>
-          </w:tcPr>
-          <w:p/>
-        </w:tc>
-        <w:tc>
-          <w:tcPr>
-            <w:tcW w:w="4340" w:type="dxa"/>
-            <w:tcBorders>
-              <w:top w:val="single" w:sz="4" w:space="0" w:color="D9D3C3"/>
-              <w:left w:val="single" w:sz="4" w:space="0" w:color="D9D3C3"/>
-              <w:bottom w:val="single" w:sz="4" w:space="0" w:color="D9D3C3"/>
-              <w:right w:val="single" w:sz="4" w:space="0" w:color="D9D3C3"/>
-            </w:tcBorders>
-            <w:tcMar>
-              <w:top w:w="90" w:type="dxa"/>
-              <w:left w:w="120" w:type="dxa"/>
-              <w:bottom w:w="90" w:type="dxa"/>
-              <w:right w:w="120" w:type="dxa"/>
-            </w:tcMar>
-            <w:vAlign w:val="center"/>
-          </w:tcPr>
-          <w:p/>
-        </w:tc>
-        <w:tc>
-          <w:tcPr>
-            <w:tcW w:w="850" w:type="dxa"/>
-            <w:tcBorders>
-              <w:top w:val="single" w:sz="4" w:space="0" w:color="D9D3C3"/>
-              <w:left w:val="single" w:sz="4" w:space="0" w:color="D9D3C3"/>
-              <w:bottom w:val="single" w:sz="4" w:space="0" w:color="D9D3C3"/>
-              <w:right w:val="single" w:sz="4" w:space="0" w:color="D9D3C3"/>
-            </w:tcBorders>
-            <w:tcMar>
-              <w:top w:w="90" w:type="dxa"/>
-              <w:left w:w="120" w:type="dxa"/>
-              <w:bottom w:w="90" w:type="dxa"/>
-              <w:right w:w="120" w:type="dxa"/>
-            </w:tcMar>
-            <w:vAlign w:val="center"/>
-          </w:tcPr>
-          <w:p/>
-        </w:tc>
-        <w:tc>
-          <w:tcPr>
-            <w:tcW w:w="1000" w:type="dxa"/>
-            <w:tcBorders>
-              <w:top w:val="single" w:sz="4" w:space="0" w:color="D9D3C3"/>
-              <w:left w:val="single" w:sz="4" w:space="0" w:color="D9D3C3"/>
-              <w:bottom w:val="single" w:sz="4" w:space="0" w:color="D9D3C3"/>
-              <w:right w:val="single" w:sz="4" w:space="0" w:color="D9D3C3"/>
-            </w:tcBorders>
-            <w:tcMar>
-              <w:top w:w="90" w:type="dxa"/>
-              <w:left w:w="120" w:type="dxa"/>
-              <w:bottom w:w="90" w:type="dxa"/>
-              <w:right w:w="120" w:type="dxa"/>
-            </w:tcMar>
-            <w:vAlign w:val="center"/>
-          </w:tcPr>
-          <w:p/>
-        </w:tc>
-        <w:tc>
-          <w:tcPr>
-            <w:tcW w:w="1100" w:type="dxa"/>
-            <w:tcBorders>
-              <w:top w:val="single" w:sz="4" w:space="0" w:color="D9D3C3"/>
-              <w:left w:val="single" w:sz="4" w:space="0" w:color="D9D3C3"/>
-              <w:bottom w:val="single" w:sz="4" w:space="0" w:color="D9D3C3"/>
-              <w:right w:val="single" w:sz="4" w:space="0" w:color="D9D3C3"/>
-            </w:tcBorders>
-            <w:tcMar>
-              <w:top w:w="90" w:type="dxa"/>
-              <w:left w:w="120" w:type="dxa"/>
-              <w:bottom w:w="90" w:type="dxa"/>
-              <w:right w:w="120" w:type="dxa"/>
-            </w:tcMar>
-            <w:vAlign w:val="center"/>
-          </w:tcPr>
-          <w:p/>
-        </w:tc>
-        <w:tc>
-          <w:tcPr>
-            <w:tcW w:w="1100" w:type="dxa"/>
-            <w:tcBorders>
-              <w:top w:val="single" w:sz="4" w:space="0" w:color="D9D3C3"/>
-              <w:left w:val="single" w:sz="4" w:space="0" w:color="D9D3C3"/>
-              <w:bottom w:val="single" w:sz="4" w:space="0" w:color="D9D3C3"/>
-              <w:right w:val="single" w:sz="4" w:space="0" w:color="D9D3C3"/>
-            </w:tcBorders>
-            <w:tcMar>
-              <w:top w:w="90" w:type="dxa"/>
-              <w:left w:w="120" w:type="dxa"/>
-              <w:bottom w:w="90" w:type="dxa"/>
-              <w:right w:w="120" w:type="dxa"/>
-            </w:tcMar>
-            <w:vAlign w:val="center"/>
-          </w:tcPr>
-          <w:p/>
-        </w:tc>
-      </w:tr>
-      <w:tr>
-        <w:tblPrEx>
-          <w:tblCellMar>
-            <w:top w:w="0" w:type="dxa"/>
-            <w:bottom w:w="0" w:type="dxa"/>
-          </w:tblCellMar>
-        </w:tblPrEx>
-        <w:trPr>
-          <w:trHeight w:val="420"/>
-        </w:trPr>
-        <w:tc>
-          <w:tcPr>
-            <w:tcW w:w="1150" w:type="dxa"/>
-            <w:tcBorders>
-              <w:top w:val="single" w:sz="4" w:space="0" w:color="D9D3C3"/>
-              <w:left w:val="single" w:sz="4" w:space="0" w:color="D9D3C3"/>
-              <w:bottom w:val="single" w:sz="4" w:space="0" w:color="D9D3C3"/>
-              <w:right w:val="single" w:sz="4" w:space="0" w:color="D9D3C3"/>
-            </w:tcBorders>
-            <w:shd w:val="clear" w:color="auto" w:fill="F7F4EE"/>
-            <w:tcMar>
-              <w:top w:w="90" w:type="dxa"/>
-              <w:left w:w="120" w:type="dxa"/>
-              <w:bottom w:w="90" w:type="dxa"/>
-              <w:right w:w="120" w:type="dxa"/>
-            </w:tcMar>
-            <w:vAlign w:val="center"/>
-          </w:tcPr>
-          <w:p/>
-        </w:tc>
-        <w:tc>
-          <w:tcPr>
-            <w:tcW w:w="4340" w:type="dxa"/>
-            <w:tcBorders>
-              <w:top w:val="single" w:sz="4" w:space="0" w:color="D9D3C3"/>
-              <w:left w:val="single" w:sz="4" w:space="0" w:color="D9D3C3"/>
-              <w:bottom w:val="single" w:sz="4" w:space="0" w:color="D9D3C3"/>
-              <w:right w:val="single" w:sz="4" w:space="0" w:color="D9D3C3"/>
-            </w:tcBorders>
-            <w:shd w:val="clear" w:color="auto" w:fill="F7F4EE"/>
-            <w:tcMar>
-              <w:top w:w="90" w:type="dxa"/>
-              <w:left w:w="120" w:type="dxa"/>
-              <w:bottom w:w="90" w:type="dxa"/>
-              <w:right w:w="120" w:type="dxa"/>
-            </w:tcMar>
-            <w:vAlign w:val="center"/>
-          </w:tcPr>
-          <w:p/>
-        </w:tc>
-        <w:tc>
-          <w:tcPr>
-            <w:tcW w:w="850" w:type="dxa"/>
-            <w:tcBorders>
-              <w:top w:val="single" w:sz="4" w:space="0" w:color="D9D3C3"/>
-              <w:left w:val="single" w:sz="4" w:space="0" w:color="D9D3C3"/>
-              <w:bottom w:val="single" w:sz="4" w:space="0" w:color="D9D3C3"/>
-              <w:right w:val="single" w:sz="4" w:space="0" w:color="D9D3C3"/>
-            </w:tcBorders>
-            <w:shd w:val="clear" w:color="auto" w:fill="F7F4EE"/>
-            <w:tcMar>
-              <w:top w:w="90" w:type="dxa"/>
-              <w:left w:w="120" w:type="dxa"/>
-              <w:bottom w:w="90" w:type="dxa"/>
-              <w:right w:w="120" w:type="dxa"/>
-            </w:tcMar>
-            <w:vAlign w:val="center"/>
-          </w:tcPr>
-          <w:p/>
-        </w:tc>
-        <w:tc>
-          <w:tcPr>
-            <w:tcW w:w="1000" w:type="dxa"/>
-            <w:tcBorders>
-              <w:top w:val="single" w:sz="4" w:space="0" w:color="D9D3C3"/>
-              <w:left w:val="single" w:sz="4" w:space="0" w:color="D9D3C3"/>
-              <w:bottom w:val="single" w:sz="4" w:space="0" w:color="D9D3C3"/>
-              <w:right w:val="single" w:sz="4" w:space="0" w:color="D9D3C3"/>
-            </w:tcBorders>
-            <w:shd w:val="clear" w:color="auto" w:fill="F7F4EE"/>
-            <w:tcMar>
-              <w:top w:w="90" w:type="dxa"/>
-              <w:left w:w="120" w:type="dxa"/>
-              <w:bottom w:w="90" w:type="dxa"/>
-              <w:right w:w="120" w:type="dxa"/>
-            </w:tcMar>
-            <w:vAlign w:val="center"/>
-          </w:tcPr>
-          <w:p/>
-        </w:tc>
-        <w:tc>
-          <w:tcPr>
-            <w:tcW w:w="1100" w:type="dxa"/>
-            <w:tcBorders>
-              <w:top w:val="single" w:sz="4" w:space="0" w:color="D9D3C3"/>
-              <w:left w:val="single" w:sz="4" w:space="0" w:color="D9D3C3"/>
-              <w:bottom w:val="single" w:sz="4" w:space="0" w:color="D9D3C3"/>
-              <w:right w:val="single" w:sz="4" w:space="0" w:color="D9D3C3"/>
-            </w:tcBorders>
-            <w:shd w:val="clear" w:color="auto" w:fill="F7F4EE"/>
-            <w:tcMar>
-              <w:top w:w="90" w:type="dxa"/>
-              <w:left w:w="120" w:type="dxa"/>
-              <w:bottom w:w="90" w:type="dxa"/>
-              <w:right w:w="120" w:type="dxa"/>
-            </w:tcMar>
-            <w:vAlign w:val="center"/>
-          </w:tcPr>
-          <w:p/>
-        </w:tc>
-        <w:tc>
-          <w:tcPr>
-            <w:tcW w:w="1100" w:type="dxa"/>
-            <w:tcBorders>
-              <w:top w:val="single" w:sz="4" w:space="0" w:color="D9D3C3"/>
-              <w:left w:val="single" w:sz="4" w:space="0" w:color="D9D3C3"/>
-              <w:bottom w:val="single" w:sz="4" w:space="0" w:color="D9D3C3"/>
-              <w:right w:val="single" w:sz="4" w:space="0" w:color="D9D3C3"/>
-            </w:tcBorders>
-            <w:shd w:val="clear" w:color="auto" w:fill="F7F4EE"/>
-            <w:tcMar>
-              <w:top w:w="90" w:type="dxa"/>
-              <w:left w:w="120" w:type="dxa"/>
-              <w:bottom w:w="90" w:type="dxa"/>
-              <w:right w:w="120" w:type="dxa"/>
-            </w:tcMar>
-            <w:vAlign w:val="center"/>
-          </w:tcPr>
-          <w:p/>
-        </w:tc>
-      </w:tr>
-      <w:tr>
-        <w:tblPrEx>
-          <w:tblCellMar>
-            <w:top w:w="0" w:type="dxa"/>
-            <w:bottom w:w="0" w:type="dxa"/>
-          </w:tblCellMar>
-        </w:tblPrEx>
-        <w:trPr>
-          <w:trHeight w:val="420"/>
-        </w:trPr>
-        <w:tc>
-          <w:tcPr>
-            <w:tcW w:w="1150" w:type="dxa"/>
-            <w:tcBorders>
-              <w:top w:val="single" w:sz="4" w:space="0" w:color="D9D3C3"/>
-              <w:left w:val="single" w:sz="4" w:space="0" w:color="D9D3C3"/>
-              <w:bottom w:val="single" w:sz="4" w:space="0" w:color="D9D3C3"/>
-              <w:right w:val="single" w:sz="4" w:space="0" w:color="D9D3C3"/>
-            </w:tcBorders>
-            <w:tcMar>
-              <w:top w:w="90" w:type="dxa"/>
-              <w:left w:w="120" w:type="dxa"/>
-              <w:bottom w:w="90" w:type="dxa"/>
-              <w:right w:w="120" w:type="dxa"/>
-            </w:tcMar>
-            <w:vAlign w:val="center"/>
-          </w:tcPr>
-          <w:p/>
-        </w:tc>
-        <w:tc>
-          <w:tcPr>
-            <w:tcW w:w="4340" w:type="dxa"/>
-            <w:tcBorders>
-              <w:top w:val="single" w:sz="4" w:space="0" w:color="D9D3C3"/>
-              <w:left w:val="single" w:sz="4" w:space="0" w:color="D9D3C3"/>
-              <w:bottom w:val="single" w:sz="4" w:space="0" w:color="D9D3C3"/>
-              <w:right w:val="single" w:sz="4" w:space="0" w:color="D9D3C3"/>
-            </w:tcBorders>
-            <w:tcMar>
-              <w:top w:w="90" w:type="dxa"/>
-              <w:left w:w="120" w:type="dxa"/>
-              <w:bottom w:w="90" w:type="dxa"/>
-              <w:right w:w="120" w:type="dxa"/>
-            </w:tcMar>
-            <w:vAlign w:val="center"/>
-          </w:tcPr>
-          <w:p/>
-        </w:tc>
-        <w:tc>
-          <w:tcPr>
-            <w:tcW w:w="850" w:type="dxa"/>
-            <w:tcBorders>
-              <w:top w:val="single" w:sz="4" w:space="0" w:color="D9D3C3"/>
-              <w:left w:val="single" w:sz="4" w:space="0" w:color="D9D3C3"/>
-              <w:bottom w:val="single" w:sz="4" w:space="0" w:color="D9D3C3"/>
-              <w:right w:val="single" w:sz="4" w:space="0" w:color="D9D3C3"/>
-            </w:tcBorders>
-            <w:tcMar>
-              <w:top w:w="90" w:type="dxa"/>
-              <w:left w:w="120" w:type="dxa"/>
-              <w:bottom w:w="90" w:type="dxa"/>
-              <w:right w:w="120" w:type="dxa"/>
-            </w:tcMar>
-            <w:vAlign w:val="center"/>
-          </w:tcPr>
-          <w:p/>
-        </w:tc>
-        <w:tc>
-          <w:tcPr>
-            <w:tcW w:w="1000" w:type="dxa"/>
-            <w:tcBorders>
-              <w:top w:val="single" w:sz="4" w:space="0" w:color="D9D3C3"/>
-              <w:left w:val="single" w:sz="4" w:space="0" w:color="D9D3C3"/>
-              <w:bottom w:val="single" w:sz="4" w:space="0" w:color="D9D3C3"/>
-              <w:right w:val="single" w:sz="4" w:space="0" w:color="D9D3C3"/>
-            </w:tcBorders>
-            <w:tcMar>
-              <w:top w:w="90" w:type="dxa"/>
-              <w:left w:w="120" w:type="dxa"/>
-              <w:bottom w:w="90" w:type="dxa"/>
-              <w:right w:w="120" w:type="dxa"/>
-            </w:tcMar>
-            <w:vAlign w:val="center"/>
-          </w:tcPr>
-          <w:p/>
-        </w:tc>
-        <w:tc>
-          <w:tcPr>
-            <w:tcW w:w="1100" w:type="dxa"/>
-            <w:tcBorders>
-              <w:top w:val="single" w:sz="4" w:space="0" w:color="D9D3C3"/>
-              <w:left w:val="single" w:sz="4" w:space="0" w:color="D9D3C3"/>
-              <w:bottom w:val="single" w:sz="4" w:space="0" w:color="D9D3C3"/>
-              <w:right w:val="single" w:sz="4" w:space="0" w:color="D9D3C3"/>
-            </w:tcBorders>
-            <w:tcMar>
-              <w:top w:w="90" w:type="dxa"/>
-              <w:left w:w="120" w:type="dxa"/>
-              <w:bottom w:w="90" w:type="dxa"/>
-              <w:right w:w="120" w:type="dxa"/>
-            </w:tcMar>
-            <w:vAlign w:val="center"/>
-          </w:tcPr>
-          <w:p/>
-        </w:tc>
-        <w:tc>
-          <w:tcPr>
-            <w:tcW w:w="1100" w:type="dxa"/>
-            <w:tcBorders>
-              <w:top w:val="single" w:sz="4" w:space="0" w:color="D9D3C3"/>
-              <w:left w:val="single" w:sz="4" w:space="0" w:color="D9D3C3"/>
-              <w:bottom w:val="single" w:sz="4" w:space="0" w:color="D9D3C3"/>
-              <w:right w:val="single" w:sz="4" w:space="0" w:color="D9D3C3"/>
-            </w:tcBorders>
-            <w:tcMar>
-              <w:top w:w="90" w:type="dxa"/>
-              <w:left w:w="120" w:type="dxa"/>
-              <w:bottom w:w="90" w:type="dxa"/>
-              <w:right w:w="120" w:type="dxa"/>
-            </w:tcMar>
-            <w:vAlign w:val="center"/>
-          </w:tcPr>
-          <w:p/>
-        </w:tc>
-      </w:tr>
-      <w:tr>
-        <w:tblPrEx>
-          <w:tblCellMar>
-            <w:top w:w="0" w:type="dxa"/>
-            <w:bottom w:w="0" w:type="dxa"/>
-          </w:tblCellMar>
-        </w:tblPrEx>
-        <w:trPr>
-          <w:trHeight w:val="420"/>
-        </w:trPr>
-        <w:tc>
-          <w:tcPr>
-            <w:tcW w:w="1150" w:type="dxa"/>
-            <w:tcBorders>
-              <w:top w:val="single" w:sz="4" w:space="0" w:color="D9D3C3"/>
-              <w:left w:val="single" w:sz="4" w:space="0" w:color="D9D3C3"/>
-              <w:bottom w:val="single" w:sz="4" w:space="0" w:color="D9D3C3"/>
-              <w:right w:val="single" w:sz="4" w:space="0" w:color="D9D3C3"/>
-            </w:tcBorders>
-            <w:shd w:val="clear" w:color="auto" w:fill="F7F4EE"/>
-            <w:tcMar>
-              <w:top w:w="90" w:type="dxa"/>
-              <w:left w:w="120" w:type="dxa"/>
-              <w:bottom w:w="90" w:type="dxa"/>
-              <w:right w:w="120" w:type="dxa"/>
-            </w:tcMar>
-            <w:vAlign w:val="center"/>
-          </w:tcPr>
-          <w:p/>
-        </w:tc>
-        <w:tc>
-          <w:tcPr>
-            <w:tcW w:w="4340" w:type="dxa"/>
-            <w:tcBorders>
-              <w:top w:val="single" w:sz="4" w:space="0" w:color="D9D3C3"/>
-              <w:left w:val="single" w:sz="4" w:space="0" w:color="D9D3C3"/>
-              <w:bottom w:val="single" w:sz="4" w:space="0" w:color="D9D3C3"/>
-              <w:right w:val="single" w:sz="4" w:space="0" w:color="D9D3C3"/>
-            </w:tcBorders>
-            <w:shd w:val="clear" w:color="auto" w:fill="F7F4EE"/>
-            <w:tcMar>
-              <w:top w:w="90" w:type="dxa"/>
-              <w:left w:w="120" w:type="dxa"/>
-              <w:bottom w:w="90" w:type="dxa"/>
-              <w:right w:w="120" w:type="dxa"/>
-            </w:tcMar>
-            <w:vAlign w:val="center"/>
-          </w:tcPr>
-          <w:p/>
-        </w:tc>
-        <w:tc>
-          <w:tcPr>
-            <w:tcW w:w="850" w:type="dxa"/>
-            <w:tcBorders>
-              <w:top w:val="single" w:sz="4" w:space="0" w:color="D9D3C3"/>
-              <w:left w:val="single" w:sz="4" w:space="0" w:color="D9D3C3"/>
-              <w:bottom w:val="single" w:sz="4" w:space="0" w:color="D9D3C3"/>
-              <w:right w:val="single" w:sz="4" w:space="0" w:color="D9D3C3"/>
-            </w:tcBorders>
-            <w:shd w:val="clear" w:color="auto" w:fill="F7F4EE"/>
-            <w:tcMar>
-              <w:top w:w="90" w:type="dxa"/>
-              <w:left w:w="120" w:type="dxa"/>
-              <w:bottom w:w="90" w:type="dxa"/>
-              <w:right w:w="120" w:type="dxa"/>
-            </w:tcMar>
-            <w:vAlign w:val="center"/>
-          </w:tcPr>
-          <w:p/>
-        </w:tc>
-        <w:tc>
-          <w:tcPr>
-            <w:tcW w:w="1000" w:type="dxa"/>
-            <w:tcBorders>
-              <w:top w:val="single" w:sz="4" w:space="0" w:color="D9D3C3"/>
-              <w:left w:val="single" w:sz="4" w:space="0" w:color="D9D3C3"/>
-              <w:bottom w:val="single" w:sz="4" w:space="0" w:color="D9D3C3"/>
-              <w:right w:val="single" w:sz="4" w:space="0" w:color="D9D3C3"/>
-            </w:tcBorders>
-            <w:shd w:val="clear" w:color="auto" w:fill="F7F4EE"/>
-            <w:tcMar>
-              <w:top w:w="90" w:type="dxa"/>
-              <w:left w:w="120" w:type="dxa"/>
-              <w:bottom w:w="90" w:type="dxa"/>
-              <w:right w:w="120" w:type="dxa"/>
-            </w:tcMar>
-            <w:vAlign w:val="center"/>
-          </w:tcPr>
-          <w:p/>
-        </w:tc>
-        <w:tc>
-          <w:tcPr>
-            <w:tcW w:w="1100" w:type="dxa"/>
-            <w:tcBorders>
-              <w:top w:val="single" w:sz="4" w:space="0" w:color="D9D3C3"/>
-              <w:left w:val="single" w:sz="4" w:space="0" w:color="D9D3C3"/>
-              <w:bottom w:val="single" w:sz="4" w:space="0" w:color="D9D3C3"/>
-              <w:right w:val="single" w:sz="4" w:space="0" w:color="D9D3C3"/>
-            </w:tcBorders>
-            <w:shd w:val="clear" w:color="auto" w:fill="F7F4EE"/>
-            <w:tcMar>
-              <w:top w:w="90" w:type="dxa"/>
-              <w:left w:w="120" w:type="dxa"/>
-              <w:bottom w:w="90" w:type="dxa"/>
-              <w:right w:w="120" w:type="dxa"/>
-            </w:tcMar>
-            <w:vAlign w:val="center"/>
-          </w:tcPr>
-          <w:p/>
-        </w:tc>
-        <w:tc>
-          <w:tcPr>
-            <w:tcW w:w="1100" w:type="dxa"/>
-            <w:tcBorders>
-              <w:top w:val="single" w:sz="4" w:space="0" w:color="D9D3C3"/>
-              <w:left w:val="single" w:sz="4" w:space="0" w:color="D9D3C3"/>
-              <w:bottom w:val="single" w:sz="4" w:space="0" w:color="D9D3C3"/>
-              <w:right w:val="single" w:sz="4" w:space="0" w:color="D9D3C3"/>
-            </w:tcBorders>
-            <w:shd w:val="clear" w:color="auto" w:fill="F7F4EE"/>
-            <w:tcMar>
-              <w:top w:w="90" w:type="dxa"/>
-              <w:left w:w="120" w:type="dxa"/>
-              <w:bottom w:w="90" w:type="dxa"/>
-              <w:right w:w="120" w:type="dxa"/>
-            </w:tcMar>
-            <w:vAlign w:val="center"/>
-          </w:tcPr>
-          <w:p/>
-        </w:tc>
-      </w:tr>
-      <w:tr>
-        <w:tblPrEx>
-          <w:tblCellMar>
-            <w:top w:w="0" w:type="dxa"/>
-            <w:bottom w:w="0" w:type="dxa"/>
-          </w:tblCellMar>
-        </w:tblPrEx>
-        <w:trPr>
-          <w:trHeight w:val="420"/>
-        </w:trPr>
-        <w:tc>
-          <w:tcPr>
-            <w:tcW w:w="1150" w:type="dxa"/>
-            <w:tcBorders>
-              <w:top w:val="single" w:sz="4" w:space="0" w:color="D9D3C3"/>
-              <w:left w:val="single" w:sz="4" w:space="0" w:color="D9D3C3"/>
-              <w:bottom w:val="single" w:sz="4" w:space="0" w:color="D9D3C3"/>
-              <w:right w:val="single" w:sz="4" w:space="0" w:color="D9D3C3"/>
-            </w:tcBorders>
-            <w:tcMar>
-              <w:top w:w="90" w:type="dxa"/>
-              <w:left w:w="120" w:type="dxa"/>
-              <w:bottom w:w="90" w:type="dxa"/>
-              <w:right w:w="120" w:type="dxa"/>
-            </w:tcMar>
-            <w:vAlign w:val="center"/>
-          </w:tcPr>
-          <w:p/>
-        </w:tc>
-        <w:tc>
-          <w:tcPr>
-            <w:tcW w:w="4340" w:type="dxa"/>
-            <w:tcBorders>
-              <w:top w:val="single" w:sz="4" w:space="0" w:color="D9D3C3"/>
-              <w:left w:val="single" w:sz="4" w:space="0" w:color="D9D3C3"/>
-              <w:bottom w:val="single" w:sz="4" w:space="0" w:color="D9D3C3"/>
-              <w:right w:val="single" w:sz="4" w:space="0" w:color="D9D3C3"/>
-            </w:tcBorders>
-            <w:tcMar>
-              <w:top w:w="90" w:type="dxa"/>
-              <w:left w:w="120" w:type="dxa"/>
-              <w:bottom w:w="90" w:type="dxa"/>
-              <w:right w:w="120" w:type="dxa"/>
-            </w:tcMar>
-            <w:vAlign w:val="center"/>
-          </w:tcPr>
-          <w:p/>
-        </w:tc>
-        <w:tc>
-          <w:tcPr>
-            <w:tcW w:w="850" w:type="dxa"/>
-            <w:tcBorders>
-              <w:top w:val="single" w:sz="4" w:space="0" w:color="D9D3C3"/>
-              <w:left w:val="single" w:sz="4" w:space="0" w:color="D9D3C3"/>
-              <w:bottom w:val="single" w:sz="4" w:space="0" w:color="D9D3C3"/>
-              <w:right w:val="single" w:sz="4" w:space="0" w:color="D9D3C3"/>
-            </w:tcBorders>
-            <w:tcMar>
-              <w:top w:w="90" w:type="dxa"/>
-              <w:left w:w="120" w:type="dxa"/>
-              <w:bottom w:w="90" w:type="dxa"/>
-              <w:right w:w="120" w:type="dxa"/>
-            </w:tcMar>
-            <w:vAlign w:val="center"/>
-          </w:tcPr>
-          <w:p/>
-        </w:tc>
-        <w:tc>
-          <w:tcPr>
-            <w:tcW w:w="1000" w:type="dxa"/>
-            <w:tcBorders>
-              <w:top w:val="single" w:sz="4" w:space="0" w:color="D9D3C3"/>
-              <w:left w:val="single" w:sz="4" w:space="0" w:color="D9D3C3"/>
-              <w:bottom w:val="single" w:sz="4" w:space="0" w:color="D9D3C3"/>
-              <w:right w:val="single" w:sz="4" w:space="0" w:color="D9D3C3"/>
-            </w:tcBorders>
-            <w:tcMar>
-              <w:top w:w="90" w:type="dxa"/>
-              <w:left w:w="120" w:type="dxa"/>
-              <w:bottom w:w="90" w:type="dxa"/>
-              <w:right w:w="120" w:type="dxa"/>
-            </w:tcMar>
-            <w:vAlign w:val="center"/>
-          </w:tcPr>
-          <w:p/>
-        </w:tc>
-        <w:tc>
-          <w:tcPr>
-            <w:tcW w:w="1100" w:type="dxa"/>
-            <w:tcBorders>
-              <w:top w:val="single" w:sz="4" w:space="0" w:color="D9D3C3"/>
-              <w:left w:val="single" w:sz="4" w:space="0" w:color="D9D3C3"/>
-              <w:bottom w:val="single" w:sz="4" w:space="0" w:color="D9D3C3"/>
-              <w:right w:val="single" w:sz="4" w:space="0" w:color="D9D3C3"/>
-            </w:tcBorders>
-            <w:tcMar>
-              <w:top w:w="90" w:type="dxa"/>
-              <w:left w:w="120" w:type="dxa"/>
-              <w:bottom w:w="90" w:type="dxa"/>
-              <w:right w:w="120" w:type="dxa"/>
-            </w:tcMar>
-            <w:vAlign w:val="center"/>
-          </w:tcPr>
-          <w:p/>
-        </w:tc>
-        <w:tc>
-          <w:tcPr>
-            <w:tcW w:w="1100" w:type="dxa"/>
-            <w:tcBorders>
-              <w:top w:val="single" w:sz="4" w:space="0" w:color="D9D3C3"/>
-              <w:left w:val="single" w:sz="4" w:space="0" w:color="D9D3C3"/>
-              <w:bottom w:val="single" w:sz="4" w:space="0" w:color="D9D3C3"/>
-              <w:right w:val="single" w:sz="4" w:space="0" w:color="D9D3C3"/>
-            </w:tcBorders>
-            <w:tcMar>
-              <w:top w:w="90" w:type="dxa"/>
-              <w:left w:w="120" w:type="dxa"/>
-              <w:bottom w:w="90" w:type="dxa"/>
-              <w:right w:w="120" w:type="dxa"/>
-            </w:tcMar>
-            <w:vAlign w:val="center"/>
-          </w:tcPr>
-          <w:p/>
-        </w:tc>
-      </w:tr>
-      <w:tr>
-        <w:tblPrEx>
-          <w:tblCellMar>
-            <w:top w:w="0" w:type="dxa"/>
-            <w:bottom w:w="0" w:type="dxa"/>
-          </w:tblCellMar>
-        </w:tblPrEx>
-        <w:trPr>
-          <w:trHeight w:val="420"/>
-        </w:trPr>
-        <w:tc>
-          <w:tcPr>
-            <w:tcW w:w="1150" w:type="dxa"/>
-            <w:tcBorders>
-              <w:top w:val="single" w:sz="4" w:space="0" w:color="D9D3C3"/>
-              <w:left w:val="single" w:sz="4" w:space="0" w:color="D9D3C3"/>
-              <w:bottom w:val="single" w:sz="4" w:space="0" w:color="D9D3C3"/>
-              <w:right w:val="single" w:sz="4" w:space="0" w:color="D9D3C3"/>
-            </w:tcBorders>
-            <w:shd w:val="clear" w:color="auto" w:fill="F7F4EE"/>
-            <w:tcMar>
-              <w:top w:w="90" w:type="dxa"/>
-              <w:left w:w="120" w:type="dxa"/>
-              <w:bottom w:w="90" w:type="dxa"/>
-              <w:right w:w="120" w:type="dxa"/>
-            </w:tcMar>
-            <w:vAlign w:val="center"/>
-          </w:tcPr>
-          <w:p/>
-        </w:tc>
-        <w:tc>
-          <w:tcPr>
-            <w:tcW w:w="4340" w:type="dxa"/>
-            <w:tcBorders>
-              <w:top w:val="single" w:sz="4" w:space="0" w:color="D9D3C3"/>
-              <w:left w:val="single" w:sz="4" w:space="0" w:color="D9D3C3"/>
-              <w:bottom w:val="single" w:sz="4" w:space="0" w:color="D9D3C3"/>
-              <w:right w:val="single" w:sz="4" w:space="0" w:color="D9D3C3"/>
-            </w:tcBorders>
-            <w:shd w:val="clear" w:color="auto" w:fill="F7F4EE"/>
-            <w:tcMar>
-              <w:top w:w="90" w:type="dxa"/>
-              <w:left w:w="120" w:type="dxa"/>
-              <w:bottom w:w="90" w:type="dxa"/>
-              <w:right w:w="120" w:type="dxa"/>
-            </w:tcMar>
-            <w:vAlign w:val="center"/>
-          </w:tcPr>
-          <w:p/>
-        </w:tc>
-        <w:tc>
-          <w:tcPr>
-            <w:tcW w:w="850" w:type="dxa"/>
-            <w:tcBorders>
-              <w:top w:val="single" w:sz="4" w:space="0" w:color="D9D3C3"/>
-              <w:left w:val="single" w:sz="4" w:space="0" w:color="D9D3C3"/>
-              <w:bottom w:val="single" w:sz="4" w:space="0" w:color="D9D3C3"/>
-              <w:right w:val="single" w:sz="4" w:space="0" w:color="D9D3C3"/>
-            </w:tcBorders>
-            <w:shd w:val="clear" w:color="auto" w:fill="F7F4EE"/>
-            <w:tcMar>
-              <w:top w:w="90" w:type="dxa"/>
-              <w:left w:w="120" w:type="dxa"/>
-              <w:bottom w:w="90" w:type="dxa"/>
-              <w:right w:w="120" w:type="dxa"/>
-            </w:tcMar>
-            <w:vAlign w:val="center"/>
-          </w:tcPr>
-          <w:p/>
-        </w:tc>
-        <w:tc>
-          <w:tcPr>
-            <w:tcW w:w="1000" w:type="dxa"/>
-            <w:tcBorders>
-              <w:top w:val="single" w:sz="4" w:space="0" w:color="D9D3C3"/>
-              <w:left w:val="single" w:sz="4" w:space="0" w:color="D9D3C3"/>
-              <w:bottom w:val="single" w:sz="4" w:space="0" w:color="D9D3C3"/>
-              <w:right w:val="single" w:sz="4" w:space="0" w:color="D9D3C3"/>
-            </w:tcBorders>
-            <w:shd w:val="clear" w:color="auto" w:fill="F7F4EE"/>
-            <w:tcMar>
-              <w:top w:w="90" w:type="dxa"/>
-              <w:left w:w="120" w:type="dxa"/>
-              <w:bottom w:w="90" w:type="dxa"/>
-              <w:right w:w="120" w:type="dxa"/>
-            </w:tcMar>
-            <w:vAlign w:val="center"/>
-          </w:tcPr>
-          <w:p/>
-        </w:tc>
-        <w:tc>
-          <w:tcPr>
-            <w:tcW w:w="1100" w:type="dxa"/>
-            <w:tcBorders>
-              <w:top w:val="single" w:sz="4" w:space="0" w:color="D9D3C3"/>
-              <w:left w:val="single" w:sz="4" w:space="0" w:color="D9D3C3"/>
-              <w:bottom w:val="single" w:sz="4" w:space="0" w:color="D9D3C3"/>
-              <w:right w:val="single" w:sz="4" w:space="0" w:color="D9D3C3"/>
-            </w:tcBorders>
-            <w:shd w:val="clear" w:color="auto" w:fill="F7F4EE"/>
-            <w:tcMar>
-              <w:top w:w="90" w:type="dxa"/>
-              <w:left w:w="120" w:type="dxa"/>
-              <w:bottom w:w="90" w:type="dxa"/>
-              <w:right w:w="120" w:type="dxa"/>
-            </w:tcMar>
-            <w:vAlign w:val="center"/>
-          </w:tcPr>
-          <w:p/>
-        </w:tc>
-        <w:tc>
-          <w:tcPr>
-            <w:tcW w:w="1100" w:type="dxa"/>
-            <w:tcBorders>
-              <w:top w:val="single" w:sz="4" w:space="0" w:color="D9D3C3"/>
-              <w:left w:val="single" w:sz="4" w:space="0" w:color="D9D3C3"/>
-              <w:bottom w:val="single" w:sz="4" w:space="0" w:color="D9D3C3"/>
-              <w:right w:val="single" w:sz="4" w:space="0" w:color="D9D3C3"/>
-            </w:tcBorders>
-            <w:shd w:val="clear" w:color="auto" w:fill="F7F4EE"/>
-            <w:tcMar>
-              <w:top w:w="90" w:type="dxa"/>
-              <w:left w:w="120" w:type="dxa"/>
-              <w:bottom w:w="90" w:type="dxa"/>
-              <w:right w:w="120" w:type="dxa"/>
-            </w:tcMar>
-            <w:vAlign w:val="center"/>
-          </w:tcPr>
-          <w:p/>
-        </w:tc>
-      </w:tr>
-      <w:tr>
-        <w:tblPrEx>
-          <w:tblCellMar>
-            <w:top w:w="0" w:type="dxa"/>
-            <w:bottom w:w="0" w:type="dxa"/>
-          </w:tblCellMar>
-        </w:tblPrEx>
-        <w:tc>
-          <w:tcPr>
-            <w:tcW w:w="8440" w:type="dxa"/>
-            <w:gridSpan w:val="5"/>
-            <w:tcBorders>
-              <w:top w:val="single" w:sz="4" w:space="0" w:color="D9D3C3"/>
-              <w:left w:val="single" w:sz="4" w:space="0" w:color="D9D3C3"/>
-              <w:bottom w:val="single" w:sz="4" w:space="0" w:color="D9D3C3"/>
-              <w:right w:val="single" w:sz="4" w:space="0" w:color="D9D3C3"/>
-            </w:tcBorders>
-            <w:shd w:val="clear" w:color="auto" w:fill="F7F4EE"/>
-            <w:tcMar>
-              <w:top w:w="90" w:type="dxa"/>
-              <w:left w:w="120" w:type="dxa"/>
-              <w:bottom w:w="90" w:type="dxa"/>
-              <w:right w:w="120" w:type="dxa"/>
-            </w:tcMar>
-            <w:vAlign w:val="center"/>
-          </w:tcPr>
-          <w:p>
-            <w:pPr>
-              <w:jc w:val="right"/>
-            </w:pPr>
-            <w:r>
-              <w:rPr>
-                <w:rFonts w:ascii="Arial" w:hAnsi="Arial" w:cs="Arial"/>
-                <w:b/>
-                <w:bCs/>
-                <w:color w:val="262626"/>
-                <w:sz w:val="16"/>
-                <w:szCs w:val="16"/>
-              </w:rPr>
-              <w:t>SUBTOTAL</w:t>
-            </w:r>
-          </w:p>
-        </w:tc>
-        <w:tc>
-          <w:tcPr>
-            <w:tcW w:w="1100" w:type="dxa"/>
-            <w:tcBorders>
-              <w:top w:val="single" w:sz="4" w:space="0" w:color="D9D3C3"/>
-              <w:left w:val="single" w:sz="4" w:space="0" w:color="D9D3C3"/>
-              <w:bottom w:val="single" w:sz="4" w:space="0" w:color="D9D3C3"/>
-              <w:right w:val="single" w:sz="4" w:space="0" w:color="D9D3C3"/>
-            </w:tcBorders>
-            <w:shd w:val="clear" w:color="auto" w:fill="F7F4EE"/>
-            <w:tcMar>
-              <w:top w:w="90" w:type="dxa"/>
-              <w:left w:w="120" w:type="dxa"/>
-              <w:bottom w:w="90" w:type="dxa"/>
-              <w:right w:w="120" w:type="dxa"/>
-            </w:tcMar>
-            <w:vAlign w:val="center"/>
-          </w:tcPr>
-          <w:p/>
-        </w:tc>
-      </w:tr>
-      <w:tr>
-        <w:tblPrEx>
-          <w:tblCellMar>
-            <w:top w:w="0" w:type="dxa"/>
-            <w:bottom w:w="0" w:type="dxa"/>
-          </w:tblCellMar>
-        </w:tblPrEx>
-        <w:tc>
-          <w:tcPr>
-            <w:tcW w:w="8440" w:type="dxa"/>
-            <w:gridSpan w:val="5"/>
-            <w:tcBorders>
-              <w:top w:val="single" w:sz="4" w:space="0" w:color="D9D3C3"/>
-              <w:left w:val="single" w:sz="4" w:space="0" w:color="D9D3C3"/>
-              <w:bottom w:val="single" w:sz="4" w:space="0" w:color="D9D3C3"/>
-              <w:right w:val="single" w:sz="4" w:space="0" w:color="D9D3C3"/>
-            </w:tcBorders>
-            <w:shd w:val="clear" w:color="auto" w:fill="F7F4EE"/>
-            <w:tcMar>
-              <w:top w:w="90" w:type="dxa"/>
-              <w:left w:w="120" w:type="dxa"/>
-              <w:bottom w:w="90" w:type="dxa"/>
-              <w:right w:w="120" w:type="dxa"/>
-            </w:tcMar>
-            <w:vAlign w:val="center"/>
-          </w:tcPr>
-          <w:p>
-            <w:pPr>
-              <w:jc w:val="right"/>
-            </w:pPr>
-            <w:r>
-              <w:rPr>
-                <w:rFonts w:ascii="Arial" w:hAnsi="Arial" w:cs="Arial"/>
-                <w:b/>
-                <w:bCs/>
-                <w:color w:val="262626"/>
-                <w:sz w:val="16"/>
-                <w:szCs w:val="16"/>
-              </w:rPr>
-              <w:t>IVA / IMPUESTOS (SI APLICA)</w:t>
-            </w:r>
-          </w:p>
-        </w:tc>
-        <w:tc>
-          <w:tcPr>
-            <w:tcW w:w="1100" w:type="dxa"/>
-            <w:tcBorders>
-              <w:top w:val="single" w:sz="4" w:space="0" w:color="D9D3C3"/>
-              <w:left w:val="single" w:sz="4" w:space="0" w:color="D9D3C3"/>
-              <w:bottom w:val="single" w:sz="4" w:space="0" w:color="D9D3C3"/>
-              <w:right w:val="single" w:sz="4" w:space="0" w:color="D9D3C3"/>
-            </w:tcBorders>
-            <w:shd w:val="clear" w:color="auto" w:fill="F7F4EE"/>
-            <w:tcMar>
-              <w:top w:w="90" w:type="dxa"/>
-              <w:left w:w="120" w:type="dxa"/>
-              <w:bottom w:w="90" w:type="dxa"/>
-              <w:right w:w="120" w:type="dxa"/>
-            </w:tcMar>
-            <w:vAlign w:val="center"/>
-          </w:tcPr>
-          <w:p/>
-        </w:tc>
-      </w:tr>
-      <w:tr>
-        <w:tblPrEx>
-          <w:tblCellMar>
-            <w:top w:w="0" w:type="dxa"/>
-            <w:bottom w:w="0" w:type="dxa"/>
-          </w:tblCellMar>
-        </w:tblPrEx>
-        <w:tc>
-          <w:tcPr>
-            <w:tcW w:w="8440" w:type="dxa"/>
-            <w:gridSpan w:val="5"/>
-            <w:tcBorders>
-              <w:top w:val="single" w:sz="4" w:space="0" w:color="D9D3C3"/>
-              <w:left w:val="single" w:sz="4" w:space="0" w:color="D9D3C3"/>
-              <w:bottom w:val="single" w:sz="4" w:space="0" w:color="D9D3C3"/>
-              <w:right w:val="single" w:sz="4" w:space="0" w:color="D9D3C3"/>
-            </w:tcBorders>
-            <w:shd w:val="clear" w:color="auto" w:fill="EFE6D2"/>
-            <w:tcMar>
-              <w:top w:w="90" w:type="dxa"/>
-              <w:left w:w="120" w:type="dxa"/>
-              <w:bottom w:w="90" w:type="dxa"/>
-              <w:right w:w="120" w:type="dxa"/>
-            </w:tcMar>
-            <w:vAlign w:val="center"/>
-          </w:tcPr>
-          <w:p>
-            <w:pPr>
-              <w:jc w:val="right"/>
-            </w:pPr>
-            <w:r>
-              <w:rPr>
-                <w:rFonts w:ascii="Arial" w:hAnsi="Arial" w:cs="Arial"/>
-                <w:b/>
-                <w:bCs/>
-                <w:color w:val="141414"/>
-                <w:sz w:val="16"/>
-                <w:szCs w:val="16"/>
-              </w:rPr>
-              <w:t>INVERSIÓN TOTAL</w:t>
-            </w:r>
-          </w:p>
-        </w:tc>
-        <w:tc>
-          <w:tcPr>
-            <w:tcW w:w="1100" w:type="dxa"/>
-            <w:tcBorders>
-              <w:top w:val="single" w:sz="4" w:space="0" w:color="D9D3C3"/>
-              <w:left w:val="single" w:sz="4" w:space="0" w:color="D9D3C3"/>
-              <w:bottom w:val="single" w:sz="4" w:space="0" w:color="D9D3C3"/>
-              <w:right w:val="single" w:sz="4" w:space="0" w:color="D9D3C3"/>
-            </w:tcBorders>
-            <w:shd w:val="clear" w:color="auto" w:fill="EFE6D2"/>
-            <w:tcMar>
-              <w:top w:w="90" w:type="dxa"/>
-              <w:left w:w="120" w:type="dxa"/>
-              <w:bottom w:w="90" w:type="dxa"/>
-              <w:right w:w="120" w:type="dxa"/>
-            </w:tcMar>
-            <w:vAlign w:val="center"/>
-          </w:tcPr>
-          <w:p/>
-        </w:tc>
-      </w:tr>
-    </w:tbl>
-    <w:p>
-      <w:pPr>
-        <w:spacing w:before="100" w:after="60"/>
-      </w:pPr>
+      <w:proofErr w:type="gramEnd"/>
       <w:r>
         <w:rPr>
           <w:rFonts w:ascii="Arial" w:hAnsi="Arial" w:cs="Arial"/>
           <w:b/>
           <w:bCs/>
-          <w:color w:val="262626"/>
-          <w:sz w:val="17"/>
-          <w:szCs w:val="17"/>
+          <w:color w:val="141414"/>
+          <w:spacing w:val="20"/>
+          <w:sz w:val="22"/>
+          <w:szCs w:val="22"/>
         </w:rPr>
-        <w:t xml:space="preserve">Moneda:  </w:t>
+        <w:t xml:space="preserve"> Total del Proyecto</w:t>
       </w:r>
-      <w:sdt>
-        <w:sdtPr>
-          <w:rPr>
-            <w:rFonts w:ascii="Arial" w:hAnsi="Arial" w:cs="Arial"/>
-            <w:b/>
-            <w:bCs/>
-            <w:color w:val="262626"/>
-            <w:sz w:val="17"/>
-            <w:szCs w:val="17"/>
-          </w:rPr>
-          <w:id w:val="-1527015320"/>
-          <w14:checkbox>
-            <w14:checked w14:val="0"/>
-            <w14:checkedState w14:val="2612" w14:font="MS Gothic"/>
-            <w14:uncheckedState w14:val="2610" w14:font="MS Gothic"/>
-          </w14:checkbox>
-        </w:sdtPr>
-        <w:sdtContent>
-          <w:r>
-            <w:rPr>
-              <w:rFonts w:ascii="MS Gothic" w:eastAsia="MS Gothic" w:hAnsi="MS Gothic" w:cs="Arial" w:hint="eastAsia"/>
-              <w:b/>
-              <w:bCs/>
-              <w:color w:val="262626"/>
-              <w:sz w:val="17"/>
-              <w:szCs w:val="17"/>
-            </w:rPr>
-            <w:t>☐</w:t>
-          </w:r>
-        </w:sdtContent>
-      </w:sdt>
-      <w:r>
+    </w:p>
+    <w:p>
+      <w:pPr>
+        <w:spacing w:after="50" w:line="250" w:lineRule="auto"/>
         <w:rPr>
-          <w:rFonts w:ascii="Arial" w:hAnsi="Arial" w:cs="Arial"/>
+          <w:rFonts w:ascii="Calibri" w:hAnsi="Calibri" w:cs="Calibri"/>
           <w:b/>
           <w:bCs/>
           <w:color w:val="262626"/>
-          <w:sz w:val="17"/>
-          <w:szCs w:val="17"/>
+          <w:sz w:val="18"/>
+          <w:szCs w:val="18"/>
         </w:rPr>
-        <w:t xml:space="preserve">  </w:t>
+      </w:pPr>
+    </w:p>
+    <w:p>
+      <w:pPr>
+        <w:spacing w:after="50" w:line="250" w:lineRule="auto"/>
+        <w:ind w:left="284"/>
+        <w:rPr>
+          <w:rFonts w:ascii="Calibri" w:hAnsi="Calibri" w:cs="Calibri"/>
+          <w:b/>
+          <w:bCs/>
+          <w:color w:val="262626"/>
+        </w:rPr>
+      </w:pPr>
+      <w:r>
+        <w:rPr>
+          <w:rFonts w:ascii="Calibri" w:hAnsi="Calibri" w:cs="Calibri"/>
+          <w:b/>
+          <w:bCs/>
+          <w:color w:val="262626"/>
+        </w:rPr>
+        <w:t>USD: ____________</w:t>
+      </w:r>
+    </w:p>
+    <w:p>
+      <w:pPr>
+        <w:spacing w:after="50" w:line="250" w:lineRule="auto"/>
+        <w:ind w:left="284"/>
+        <w:rPr>
+          <w:rFonts w:ascii="Calibri" w:hAnsi="Calibri" w:cs="Calibri"/>
+          <w:b/>
+          <w:bCs/>
+          <w:color w:val="262626"/>
+        </w:rPr>
+      </w:pPr>
+      <w:r>
+        <w:rPr>
+          <w:rFonts w:ascii="Calibri" w:hAnsi="Calibri" w:cs="Calibri"/>
+          <w:b/>
+          <w:bCs/>
+          <w:color w:val="262626"/>
+        </w:rPr>
+        <w:t>MXN: ____________</w:t>
+      </w:r>
+    </w:p>
+    <w:p>
+      <w:pPr>
+        <w:spacing w:after="50" w:line="250" w:lineRule="auto"/>
+        <w:rPr>
+          <w:rFonts w:ascii="Calibri" w:hAnsi="Calibri" w:cs="Calibri"/>
+          <w:color w:val="262626"/>
+          <w:sz w:val="18"/>
+          <w:szCs w:val="18"/>
+        </w:rPr>
+      </w:pPr>
+    </w:p>
+    <w:p>
+      <w:pPr>
+        <w:spacing w:after="50" w:line="250" w:lineRule="auto"/>
+        <w:ind w:left="284"/>
+        <w:rPr>
+          <w:rFonts w:ascii="Calibri" w:hAnsi="Calibri" w:cs="Calibri"/>
+          <w:color w:val="262626"/>
+          <w:sz w:val="18"/>
+          <w:szCs w:val="18"/>
+        </w:rPr>
+      </w:pPr>
+      <w:r>
+        <w:rPr>
+          <w:rFonts w:ascii="Calibri" w:hAnsi="Calibri" w:cs="Calibri"/>
+          <w:color w:val="262626"/>
+          <w:sz w:val="18"/>
+          <w:szCs w:val="18"/>
+        </w:rPr>
+        <w:t>La inversión contempla los materiales, insumos, preparación, instalación y servicios especificados en esta propuesta.</w:t>
+      </w:r>
+    </w:p>
+    <w:p>
+      <w:pPr>
+        <w:spacing w:after="50" w:line="250" w:lineRule="auto"/>
+        <w:rPr>
+          <w:rFonts w:ascii="Calibri" w:hAnsi="Calibri" w:cs="Calibri"/>
+          <w:color w:val="262626"/>
+          <w:sz w:val="18"/>
+          <w:szCs w:val="18"/>
+        </w:rPr>
+      </w:pPr>
+    </w:p>
+    <w:p>
+      <w:pPr>
+        <w:pStyle w:val="Prrafodelista"/>
+        <w:spacing w:after="50" w:line="250" w:lineRule="auto"/>
+        <w:ind w:left="340"/>
+        <w:rPr>
+          <w:rFonts w:ascii="Calibri" w:hAnsi="Calibri" w:cs="Calibri"/>
+          <w:b/>
+          <w:bCs/>
+          <w:color w:val="262626"/>
+          <w:sz w:val="22"/>
+          <w:szCs w:val="22"/>
+        </w:rPr>
+      </w:pPr>
+      <w:r>
+        <w:rPr>
+          <w:rFonts w:ascii="Calibri" w:hAnsi="Calibri" w:cs="Calibri"/>
+          <w:b/>
+          <w:bCs/>
+          <w:color w:val="262626"/>
+          <w:sz w:val="22"/>
+          <w:szCs w:val="22"/>
+        </w:rPr>
+        <w:t xml:space="preserve">FORMA DE PAGO </w:t>
+      </w:r>
+    </w:p>
+    <w:p>
+      <w:pPr>
+        <w:pStyle w:val="Prrafodelista"/>
+        <w:numPr>
+          <w:ilvl w:val="0"/>
+          <w:numId w:val="2"/>
+        </w:numPr>
+        <w:spacing w:after="50" w:line="250" w:lineRule="auto"/>
+        <w:rPr>
+          <w:rFonts w:ascii="Calibri" w:hAnsi="Calibri" w:cs="Calibri"/>
+          <w:b/>
+          <w:bCs/>
+          <w:color w:val="262626"/>
+          <w:sz w:val="18"/>
+          <w:szCs w:val="18"/>
+        </w:rPr>
+      </w:pPr>
+      <w:r>
+        <w:rPr>
+          <w:rFonts w:ascii="Calibri" w:hAnsi="Calibri" w:cs="Calibri"/>
+          <w:b/>
+          <w:bCs/>
+          <w:color w:val="262626"/>
+          <w:sz w:val="18"/>
+          <w:szCs w:val="18"/>
+        </w:rPr>
+        <w:t xml:space="preserve">50% - AL INICIAR LA INSTALACIÓN </w:t>
+      </w:r>
+    </w:p>
+    <w:p>
+      <w:pPr>
+        <w:pStyle w:val="Prrafodelista"/>
+        <w:numPr>
+          <w:ilvl w:val="0"/>
+          <w:numId w:val="2"/>
+        </w:numPr>
+        <w:spacing w:after="50" w:line="250" w:lineRule="auto"/>
+        <w:rPr>
+          <w:rFonts w:ascii="Calibri" w:hAnsi="Calibri" w:cs="Calibri"/>
+          <w:b/>
+          <w:bCs/>
+          <w:color w:val="262626"/>
+          <w:sz w:val="18"/>
+          <w:szCs w:val="18"/>
+        </w:rPr>
+      </w:pPr>
+      <w:r>
+        <w:rPr>
+          <w:rFonts w:ascii="Calibri" w:hAnsi="Calibri" w:cs="Calibri"/>
+          <w:b/>
+          <w:bCs/>
+          <w:color w:val="262626"/>
+          <w:sz w:val="18"/>
+          <w:szCs w:val="18"/>
+        </w:rPr>
+        <w:t xml:space="preserve">50% - AL FINALIZAR EL PROYECTO </w:t>
+      </w:r>
+    </w:p>
+    <w:p>
+      <w:pPr>
+        <w:pStyle w:val="Prrafodelista"/>
+        <w:spacing w:after="50" w:line="250" w:lineRule="auto"/>
+        <w:ind w:left="340"/>
+        <w:rPr>
+          <w:rFonts w:ascii="Calibri" w:hAnsi="Calibri" w:cs="Calibri"/>
+          <w:color w:val="262626"/>
+          <w:sz w:val="18"/>
+          <w:szCs w:val="18"/>
+        </w:rPr>
+      </w:pPr>
+    </w:p>
+    <w:p>
+      <w:pPr>
+        <w:pStyle w:val="Prrafodelista"/>
+        <w:spacing w:after="50" w:line="250" w:lineRule="auto"/>
+        <w:ind w:left="340"/>
+        <w:rPr>
+          <w:rFonts w:ascii="Calibri" w:hAnsi="Calibri" w:cs="Calibri"/>
+          <w:b/>
+          <w:bCs/>
+          <w:color w:val="262626"/>
+          <w:sz w:val="22"/>
+          <w:szCs w:val="22"/>
+        </w:rPr>
+      </w:pPr>
+      <w:r>
+        <w:rPr>
+          <w:rFonts w:ascii="Calibri" w:hAnsi="Calibri" w:cs="Calibri"/>
+          <w:b/>
+          <w:bCs/>
+          <w:color w:val="262626"/>
+          <w:sz w:val="22"/>
+          <w:szCs w:val="22"/>
+        </w:rPr>
+        <w:t>TIEMPO ESTIMADO</w:t>
+      </w:r>
+    </w:p>
+    <w:p>
+      <w:pPr>
+        <w:pStyle w:val="Prrafodelista"/>
+        <w:numPr>
+          <w:ilvl w:val="0"/>
+          <w:numId w:val="2"/>
+        </w:numPr>
+        <w:spacing w:after="50" w:line="250" w:lineRule="auto"/>
+        <w:rPr>
+          <w:rFonts w:ascii="Calibri" w:hAnsi="Calibri" w:cs="Calibri"/>
+          <w:color w:val="262626"/>
+          <w:sz w:val="18"/>
+          <w:szCs w:val="18"/>
+        </w:rPr>
+      </w:pPr>
+      <w:r>
+        <w:rPr>
+          <w:rFonts w:ascii="Calibri" w:hAnsi="Calibri" w:cs="Calibri"/>
+          <w:color w:val="262626"/>
+          <w:sz w:val="18"/>
+          <w:szCs w:val="18"/>
+        </w:rPr>
+        <w:t xml:space="preserve">Duración del proyecto: </w:t>
       </w:r>
       <w:r>
         <w:rPr>
           <w:rFonts w:ascii="Calibri" w:hAnsi="Calibri" w:cs="Calibri"/>
           <w:color w:val="262626"/>
-          <w:sz w:val="17"/>
-          <w:szCs w:val="17"/>
+          <w:sz w:val="18"/>
+          <w:szCs w:val="18"/>
         </w:rPr>
-        <w:t xml:space="preserve">USD      </w:t>
+        <w:t>___</w:t>
       </w:r>
-      <w:sdt>
-        <w:sdtPr>
-          <w:rPr>
-            <w:rFonts w:ascii="Calibri" w:hAnsi="Calibri" w:cs="Calibri"/>
-            <w:color w:val="262626"/>
-            <w:sz w:val="17"/>
-            <w:szCs w:val="17"/>
-          </w:rPr>
-          <w:id w:val="1096596343"/>
-          <w14:checkbox>
-            <w14:checked w14:val="0"/>
-            <w14:checkedState w14:val="2612" w14:font="MS Gothic"/>
-            <w14:uncheckedState w14:val="2610" w14:font="MS Gothic"/>
-          </w14:checkbox>
-        </w:sdtPr>
-        <w:sdtContent>
-          <w:r>
-            <w:rPr>
-              <w:rFonts w:ascii="MS Gothic" w:eastAsia="MS Gothic" w:hAnsi="MS Gothic" w:cs="Calibri" w:hint="eastAsia"/>
-              <w:color w:val="262626"/>
-              <w:sz w:val="17"/>
-              <w:szCs w:val="17"/>
-            </w:rPr>
-            <w:t>☐</w:t>
-          </w:r>
-        </w:sdtContent>
-      </w:sdt>
       <w:r>
         <w:rPr>
           <w:rFonts w:ascii="Calibri" w:hAnsi="Calibri" w:cs="Calibri"/>
           <w:color w:val="262626"/>
-          <w:sz w:val="17"/>
-          <w:szCs w:val="17"/>
+          <w:sz w:val="18"/>
+          <w:szCs w:val="18"/>
         </w:rPr>
-        <w:t xml:space="preserve"> MXN</w:t>
+        <w:t xml:space="preserve">días de trabajo </w:t>
       </w:r>
+    </w:p>
+    <w:p>
+      <w:pPr>
+        <w:pStyle w:val="Prrafodelista"/>
+        <w:spacing w:after="50" w:line="250" w:lineRule="auto"/>
+        <w:ind w:left="340"/>
+        <w:rPr>
+          <w:rFonts w:ascii="Calibri" w:hAnsi="Calibri" w:cs="Calibri"/>
+          <w:color w:val="262626"/>
+          <w:sz w:val="18"/>
+          <w:szCs w:val="18"/>
+        </w:rPr>
+      </w:pPr>
+    </w:p>
+    <w:p>
+      <w:pPr>
+        <w:pStyle w:val="Prrafodelista"/>
+        <w:spacing w:after="50" w:line="250" w:lineRule="auto"/>
+        <w:ind w:left="340"/>
+        <w:rPr>
+          <w:rFonts w:ascii="Calibri" w:hAnsi="Calibri" w:cs="Calibri"/>
+          <w:color w:val="262626"/>
+          <w:sz w:val="18"/>
+          <w:szCs w:val="18"/>
+        </w:rPr>
+      </w:pPr>
       <w:r>
         <w:rPr>
           <w:rFonts w:ascii="Calibri" w:hAnsi="Calibri" w:cs="Calibri"/>
-          <w:i/>
-          <w:iCs/>
-          <w:color w:val="6E6A61"/>
-          <w:sz w:val="16"/>
-          <w:szCs w:val="16"/>
+          <w:color w:val="262626"/>
+          <w:sz w:val="18"/>
+          <w:szCs w:val="18"/>
         </w:rPr>
-        <w:t xml:space="preserve">      La inversión contempla materiales, insumos, preparación, instalación y servicios especificados en esta propuesta.</w:t>
+        <w:t>El tiempo de ejecución podrá variar de acuerdo con las condiciones del área o modificaciones autorizadas durante el proyecto. Cualquier trabajo adicional será previamente autorizado y cotizado por separado.</w:t>
       </w:r>
+    </w:p>
+    <w:p>
+      <w:pPr>
+        <w:spacing w:before="100" w:after="60"/>
+      </w:pPr>
     </w:p>
     <w:p>
       <w:pPr>
@@ -3381,12 +2073,6 @@
         <w:gridCol w:w="3513"/>
       </w:tblGrid>
       <w:tr>
-        <w:tblPrEx>
-          <w:tblCellMar>
-            <w:top w:w="0" w:type="dxa"/>
-            <w:bottom w:w="0" w:type="dxa"/>
-          </w:tblCellMar>
-        </w:tblPrEx>
         <w:tc>
           <w:tcPr>
             <w:tcW w:w="3514" w:type="dxa"/>
@@ -3424,12 +2110,6 @@
               <w:gridCol w:w="3254"/>
             </w:tblGrid>
             <w:tr>
-              <w:tblPrEx>
-                <w:tblCellMar>
-                  <w:top w:w="0" w:type="dxa"/>
-                  <w:bottom w:w="0" w:type="dxa"/>
-                </w:tblCellMar>
-              </w:tblPrEx>
               <w:trPr>
                 <w:trHeight w:val="2450"/>
               </w:trPr>
@@ -3526,12 +2206,6 @@
               <w:gridCol w:w="3253"/>
             </w:tblGrid>
             <w:tr>
-              <w:tblPrEx>
-                <w:tblCellMar>
-                  <w:top w:w="0" w:type="dxa"/>
-                  <w:bottom w:w="0" w:type="dxa"/>
-                </w:tblCellMar>
-              </w:tblPrEx>
               <w:trPr>
                 <w:trHeight w:val="2450"/>
               </w:trPr>
@@ -3628,12 +2302,6 @@
               <w:gridCol w:w="3253"/>
             </w:tblGrid>
             <w:tr>
-              <w:tblPrEx>
-                <w:tblCellMar>
-                  <w:top w:w="0" w:type="dxa"/>
-                  <w:bottom w:w="0" w:type="dxa"/>
-                </w:tblCellMar>
-              </w:tblPrEx>
               <w:trPr>
                 <w:trHeight w:val="2450"/>
               </w:trPr>
@@ -3695,12 +2363,6 @@
         </w:tc>
       </w:tr>
       <w:tr>
-        <w:tblPrEx>
-          <w:tblCellMar>
-            <w:top w:w="0" w:type="dxa"/>
-            <w:bottom w:w="0" w:type="dxa"/>
-          </w:tblCellMar>
-        </w:tblPrEx>
         <w:tc>
           <w:tcPr>
             <w:tcW w:w="3514" w:type="dxa"/>
@@ -3808,6 +2470,22 @@
         </w:tc>
       </w:tr>
     </w:tbl>
+    <w:p>
+      <w:pPr>
+        <w:pBdr>
+          <w:bottom w:val="single" w:sz="10" w:space="3" w:color="B08A2E"/>
+        </w:pBdr>
+        <w:spacing w:before="300" w:after="160"/>
+        <w:rPr>
+          <w:rFonts w:ascii="Arial" w:hAnsi="Arial" w:cs="Arial"/>
+          <w:b/>
+          <w:bCs/>
+          <w:color w:val="B08A2E"/>
+          <w:sz w:val="24"/>
+          <w:szCs w:val="24"/>
+        </w:rPr>
+      </w:pPr>
+    </w:p>
     <w:p>
       <w:pPr>
         <w:pBdr>
@@ -3876,12 +2554,6 @@
         <w:gridCol w:w="10540"/>
       </w:tblGrid>
       <w:tr>
-        <w:tblPrEx>
-          <w:tblCellMar>
-            <w:top w:w="0" w:type="dxa"/>
-            <w:bottom w:w="0" w:type="dxa"/>
-          </w:tblCellMar>
-        </w:tblPrEx>
         <w:trPr>
           <w:trHeight w:val="420"/>
         </w:trPr>
@@ -3912,12 +2584,6 @@
         </w:tc>
       </w:tr>
       <w:tr>
-        <w:tblPrEx>
-          <w:tblCellMar>
-            <w:top w:w="0" w:type="dxa"/>
-            <w:bottom w:w="0" w:type="dxa"/>
-          </w:tblCellMar>
-        </w:tblPrEx>
         <w:trPr>
           <w:trHeight w:val="420"/>
         </w:trPr>
@@ -3948,12 +2614,6 @@
         </w:tc>
       </w:tr>
       <w:tr>
-        <w:tblPrEx>
-          <w:tblCellMar>
-            <w:top w:w="0" w:type="dxa"/>
-            <w:bottom w:w="0" w:type="dxa"/>
-          </w:tblCellMar>
-        </w:tblPrEx>
         <w:trPr>
           <w:trHeight w:val="420"/>
         </w:trPr>
@@ -4035,12 +2695,6 @@
         <w:gridCol w:w="5270"/>
       </w:tblGrid>
       <w:tr>
-        <w:tblPrEx>
-          <w:tblCellMar>
-            <w:top w:w="0" w:type="dxa"/>
-            <w:bottom w:w="0" w:type="dxa"/>
-          </w:tblCellMar>
-        </w:tblPrEx>
         <w:tc>
           <w:tcPr>
             <w:tcW w:w="5270" w:type="dxa"/>
@@ -4159,12 +2813,6 @@
         </w:tc>
       </w:tr>
       <w:tr>
-        <w:tblPrEx>
-          <w:tblCellMar>
-            <w:top w:w="0" w:type="dxa"/>
-            <w:bottom w:w="0" w:type="dxa"/>
-          </w:tblCellMar>
-        </w:tblPrEx>
         <w:tc>
           <w:tcPr>
             <w:tcW w:w="5270" w:type="dxa"/>
@@ -4334,12 +2982,6 @@
         <w:gridCol w:w="5270"/>
       </w:tblGrid>
       <w:tr>
-        <w:tblPrEx>
-          <w:tblCellMar>
-            <w:top w:w="0" w:type="dxa"/>
-            <w:bottom w:w="0" w:type="dxa"/>
-          </w:tblCellMar>
-        </w:tblPrEx>
         <w:tc>
           <w:tcPr>
             <w:tcW w:w="5270" w:type="dxa"/>
@@ -4389,7 +3031,16 @@
                 <w:sz w:val="18"/>
                 <w:szCs w:val="18"/>
               </w:rPr>
-              <w:t>12 meses de garantía en la instalación a partir de la entrega del proyecto.</w:t>
+              <w:t>7</w:t>
+            </w:r>
+            <w:r>
+              <w:rPr>
+                <w:rFonts w:ascii="Calibri" w:hAnsi="Calibri" w:cs="Calibri"/>
+                <w:color w:val="262626"/>
+                <w:sz w:val="18"/>
+                <w:szCs w:val="18"/>
+              </w:rPr>
+              <w:t xml:space="preserve"> meses de garantía en la instalación a partir de la entrega del proyecto.</w:t>
             </w:r>
           </w:p>
           <w:p>
@@ -4636,12 +3287,6 @@
         <w:gridCol w:w="2635"/>
       </w:tblGrid>
       <w:tr>
-        <w:tblPrEx>
-          <w:tblCellMar>
-            <w:top w:w="0" w:type="dxa"/>
-            <w:bottom w:w="0" w:type="dxa"/>
-          </w:tblCellMar>
-        </w:tblPrEx>
         <w:tc>
           <w:tcPr>
             <w:tcW w:w="2635" w:type="dxa"/>
@@ -4889,12 +3534,6 @@
         <w:gridCol w:w="5270"/>
       </w:tblGrid>
       <w:tr>
-        <w:tblPrEx>
-          <w:tblCellMar>
-            <w:top w:w="0" w:type="dxa"/>
-            <w:bottom w:w="0" w:type="dxa"/>
-          </w:tblCellMar>
-        </w:tblPrEx>
         <w:tc>
           <w:tcPr>
             <w:tcW w:w="5270" w:type="dxa"/>
@@ -5114,12 +3753,6 @@
         <w:gridCol w:w="10540"/>
       </w:tblGrid>
       <w:tr>
-        <w:tblPrEx>
-          <w:tblCellMar>
-            <w:top w:w="0" w:type="dxa"/>
-            <w:bottom w:w="0" w:type="dxa"/>
-          </w:tblCellMar>
-        </w:tblPrEx>
         <w:tc>
           <w:tcPr>
             <w:tcW w:w="10540" w:type="dxa"/>
@@ -5177,7 +3810,31 @@
                 <w:sz w:val="14"/>
                 <w:szCs w:val="14"/>
               </w:rPr>
-              <w:t>Nogales, Sonora  ·  Rio Rico, AZ   —   Creando espacios, reinventando hogares.</w:t>
+              <w:t xml:space="preserve">Nogales, </w:t>
+            </w:r>
+            <w:proofErr w:type="gramStart"/>
+            <w:r>
+              <w:rPr>
+                <w:rFonts w:ascii="Calibri" w:hAnsi="Calibri" w:cs="Calibri"/>
+                <w:i/>
+                <w:iCs/>
+                <w:color w:val="B9B3A6"/>
+                <w:sz w:val="14"/>
+                <w:szCs w:val="14"/>
+              </w:rPr>
+              <w:t>Sonora  ·</w:t>
+            </w:r>
+            <w:proofErr w:type="gramEnd"/>
+            <w:r>
+              <w:rPr>
+                <w:rFonts w:ascii="Calibri" w:hAnsi="Calibri" w:cs="Calibri"/>
+                <w:i/>
+                <w:iCs/>
+                <w:color w:val="B9B3A6"/>
+                <w:sz w:val="14"/>
+                <w:szCs w:val="14"/>
+              </w:rPr>
+              <w:t xml:space="preserve">  Rio Rico, AZ   —   Creando espacios, reinventando hogares.</w:t>
             </w:r>
           </w:p>
         </w:tc>

</xml_diff>